<commit_message>
PKM KC and User Testing Modify Adjustment
</commit_message>
<xml_diff>
--- a/User Testing Group1.docx
+++ b/User Testing Group1.docx
@@ -68,7 +68,7 @@
           </w:tcPr>
           <w:p>
             <w:pPr>
-              <w:spacing w:beforeLines="20" w:before="48" w:afterLines="20" w:after="48" w:line="259" w:lineRule="auto"/>
+              <w:spacing w:before="40" w:after="40" w:line="259" w:lineRule="auto"/>
               <w:jc w:val="center"/>
               <w:rPr>
                 <w:rFonts w:ascii="Times New Roman" w:hAnsi="Times New Roman" w:cs="Times New Roman"/>
@@ -88,18 +88,19 @@
                 <w:szCs w:val="20"/>
                 <w:lang w:val="en-ID"/>
               </w:rPr>
-              <w:t>Fitur</w:t>
-            </w:r>
-          </w:p>
-        </w:tc>
-        <w:tc>
-          <w:tcPr>
-            <w:tcW w:w="0" w:type="auto"/>
-            <w:hideMark/>
-          </w:tcPr>
-          <w:p>
-            <w:pPr>
-              <w:spacing w:beforeLines="20" w:before="48" w:afterLines="20" w:after="48" w:line="259" w:lineRule="auto"/>
+              <w:t>Kategori</w:t>
+            </w:r>
+          </w:p>
+        </w:tc>
+        <w:tc>
+          <w:tcPr>
+            <w:tcW w:w="5901" w:type="dxa"/>
+            <w:gridSpan w:val="2"/>
+            <w:hideMark/>
+          </w:tcPr>
+          <w:p>
+            <w:pPr>
+              <w:spacing w:before="40" w:after="40" w:line="259" w:lineRule="auto"/>
               <w:jc w:val="center"/>
               <w:rPr>
                 <w:rFonts w:ascii="Times New Roman" w:hAnsi="Times New Roman" w:cs="Times New Roman"/>
@@ -119,38 +120,7 @@
                 <w:szCs w:val="20"/>
                 <w:lang w:val="en-ID"/>
               </w:rPr>
-              <w:t>Test Case / Cara Kerja</w:t>
-            </w:r>
-          </w:p>
-        </w:tc>
-        <w:tc>
-          <w:tcPr>
-            <w:tcW w:w="2233" w:type="dxa"/>
-            <w:hideMark/>
-          </w:tcPr>
-          <w:p>
-            <w:pPr>
-              <w:spacing w:beforeLines="20" w:before="48" w:afterLines="20" w:after="48" w:line="259" w:lineRule="auto"/>
-              <w:jc w:val="center"/>
-              <w:rPr>
-                <w:rFonts w:ascii="Times New Roman" w:hAnsi="Times New Roman" w:cs="Times New Roman"/>
-                <w:b/>
-                <w:bCs/>
-                <w:sz w:val="20"/>
-                <w:szCs w:val="20"/>
-                <w:lang w:val="en-ID"/>
-              </w:rPr>
-            </w:pPr>
-            <w:r>
-              <w:rPr>
-                <w:rFonts w:ascii="Times New Roman" w:hAnsi="Times New Roman" w:cs="Times New Roman"/>
-                <w:b/>
-                <w:bCs/>
-                <w:sz w:val="20"/>
-                <w:szCs w:val="20"/>
-                <w:lang w:val="en-ID"/>
-              </w:rPr>
-              <w:t>Data</w:t>
+              <w:t>Fitur yang Diuji</w:t>
             </w:r>
           </w:p>
         </w:tc>
@@ -161,7 +131,7 @@
           </w:tcPr>
           <w:p>
             <w:pPr>
-              <w:spacing w:beforeLines="20" w:before="48" w:afterLines="20" w:after="48" w:line="259" w:lineRule="auto"/>
+              <w:spacing w:before="40" w:after="40" w:line="259" w:lineRule="auto"/>
               <w:jc w:val="center"/>
               <w:rPr>
                 <w:rFonts w:ascii="Times New Roman" w:hAnsi="Times New Roman" w:cs="Times New Roman"/>
@@ -190,6 +160,1017 @@
         <w:tc>
           <w:tcPr>
             <w:tcW w:w="0" w:type="auto"/>
+            <w:shd w:val="clear" w:color="auto" w:fill="DEEAF6" w:themeFill="accent5" w:themeFillTint="33"/>
+            <w:hideMark/>
+          </w:tcPr>
+          <w:p>
+            <w:pPr>
+              <w:spacing w:before="40" w:after="40" w:line="259" w:lineRule="auto"/>
+              <w:rPr>
+                <w:rFonts w:ascii="Times New Roman" w:hAnsi="Times New Roman" w:cs="Times New Roman"/>
+                <w:sz w:val="20"/>
+                <w:szCs w:val="20"/>
+                <w:lang w:val="en-ID"/>
+              </w:rPr>
+            </w:pPr>
+            <w:r>
+              <w:rPr>
+                <w:rFonts w:ascii="Times New Roman" w:hAnsi="Times New Roman" w:cs="Times New Roman"/>
+                <w:sz w:val="20"/>
+                <w:szCs w:val="20"/>
+                <w:lang w:val="en-ID"/>
+              </w:rPr>
+              <w:t>Autentikasi</w:t>
+            </w:r>
+          </w:p>
+        </w:tc>
+        <w:tc>
+          <w:tcPr>
+            <w:tcW w:w="0" w:type="auto"/>
+            <w:gridSpan w:val="2"/>
+            <w:shd w:val="clear" w:color="auto" w:fill="DEEAF6" w:themeFill="accent5" w:themeFillTint="33"/>
+            <w:hideMark/>
+          </w:tcPr>
+          <w:p>
+            <w:pPr>
+              <w:spacing w:before="40" w:after="40" w:line="259" w:lineRule="auto"/>
+              <w:rPr>
+                <w:rFonts w:ascii="Times New Roman" w:hAnsi="Times New Roman" w:cs="Times New Roman"/>
+                <w:sz w:val="20"/>
+                <w:szCs w:val="20"/>
+                <w:lang w:val="en-ID"/>
+              </w:rPr>
+            </w:pPr>
+            <w:r>
+              <w:rPr>
+                <w:rFonts w:ascii="Times New Roman" w:hAnsi="Times New Roman" w:cs="Times New Roman"/>
+                <w:sz w:val="20"/>
+                <w:szCs w:val="20"/>
+                <w:lang w:val="en-ID"/>
+              </w:rPr>
+              <w:t>Sign Up, Login, Validasi Kredensial, Error Login</w:t>
+            </w:r>
+          </w:p>
+        </w:tc>
+        <w:tc>
+          <w:tcPr>
+            <w:tcW w:w="0" w:type="auto"/>
+            <w:hideMark/>
+          </w:tcPr>
+          <w:p>
+            <w:pPr>
+              <w:spacing w:before="40" w:after="40" w:line="259" w:lineRule="auto"/>
+              <w:jc w:val="center"/>
+              <w:rPr>
+                <w:rFonts w:ascii="Times New Roman" w:hAnsi="Times New Roman" w:cs="Times New Roman"/>
+                <w:b/>
+                <w:bCs/>
+                <w:sz w:val="20"/>
+                <w:szCs w:val="20"/>
+                <w:lang w:val="en-ID"/>
+              </w:rPr>
+            </w:pPr>
+            <w:r>
+              <w:rPr>
+                <w:rFonts w:ascii="Times New Roman" w:hAnsi="Times New Roman" w:cs="Times New Roman"/>
+                <w:b/>
+                <w:bCs/>
+                <w:sz w:val="20"/>
+                <w:szCs w:val="20"/>
+                <w:lang w:val="en-ID"/>
+              </w:rPr>
+              <w:t>Pass</w:t>
+            </w:r>
+          </w:p>
+        </w:tc>
+      </w:tr>
+      <w:tr>
+        <w:tc>
+          <w:tcPr>
+            <w:tcW w:w="0" w:type="auto"/>
+            <w:shd w:val="clear" w:color="auto" w:fill="FBE4D5" w:themeFill="accent2" w:themeFillTint="33"/>
+            <w:hideMark/>
+          </w:tcPr>
+          <w:p>
+            <w:pPr>
+              <w:spacing w:before="40" w:after="40" w:line="259" w:lineRule="auto"/>
+              <w:rPr>
+                <w:rFonts w:ascii="Times New Roman" w:hAnsi="Times New Roman" w:cs="Times New Roman"/>
+                <w:sz w:val="20"/>
+                <w:szCs w:val="20"/>
+                <w:lang w:val="en-ID"/>
+              </w:rPr>
+            </w:pPr>
+            <w:r>
+              <w:rPr>
+                <w:rFonts w:ascii="Times New Roman" w:hAnsi="Times New Roman" w:cs="Times New Roman"/>
+                <w:sz w:val="20"/>
+                <w:szCs w:val="20"/>
+                <w:lang w:val="en-ID"/>
+              </w:rPr>
+              <w:t>Dashboard</w:t>
+            </w:r>
+          </w:p>
+        </w:tc>
+        <w:tc>
+          <w:tcPr>
+            <w:tcW w:w="0" w:type="auto"/>
+            <w:gridSpan w:val="2"/>
+            <w:shd w:val="clear" w:color="auto" w:fill="FBE4D5" w:themeFill="accent2" w:themeFillTint="33"/>
+            <w:hideMark/>
+          </w:tcPr>
+          <w:p>
+            <w:pPr>
+              <w:spacing w:before="40" w:after="40" w:line="259" w:lineRule="auto"/>
+              <w:rPr>
+                <w:rFonts w:ascii="Times New Roman" w:hAnsi="Times New Roman" w:cs="Times New Roman"/>
+                <w:sz w:val="20"/>
+                <w:szCs w:val="20"/>
+                <w:lang w:val="en-ID"/>
+              </w:rPr>
+            </w:pPr>
+            <w:r>
+              <w:rPr>
+                <w:rFonts w:ascii="Times New Roman" w:hAnsi="Times New Roman" w:cs="Times New Roman"/>
+                <w:sz w:val="20"/>
+                <w:szCs w:val="20"/>
+                <w:lang w:val="en-ID"/>
+              </w:rPr>
+              <w:t>Dashboard, Saldo Koin, Status Bermain</w:t>
+            </w:r>
+          </w:p>
+        </w:tc>
+        <w:tc>
+          <w:tcPr>
+            <w:tcW w:w="0" w:type="auto"/>
+            <w:hideMark/>
+          </w:tcPr>
+          <w:p>
+            <w:pPr>
+              <w:spacing w:before="40" w:after="40" w:line="259" w:lineRule="auto"/>
+              <w:jc w:val="center"/>
+              <w:rPr>
+                <w:rFonts w:ascii="Times New Roman" w:hAnsi="Times New Roman" w:cs="Times New Roman"/>
+                <w:b/>
+                <w:bCs/>
+                <w:sz w:val="20"/>
+                <w:szCs w:val="20"/>
+                <w:lang w:val="en-ID"/>
+              </w:rPr>
+            </w:pPr>
+            <w:r>
+              <w:rPr>
+                <w:rFonts w:ascii="Times New Roman" w:hAnsi="Times New Roman" w:cs="Times New Roman"/>
+                <w:b/>
+                <w:bCs/>
+                <w:sz w:val="20"/>
+                <w:szCs w:val="20"/>
+                <w:lang w:val="en-ID"/>
+              </w:rPr>
+              <w:t>Pass</w:t>
+            </w:r>
+          </w:p>
+        </w:tc>
+      </w:tr>
+      <w:tr>
+        <w:tc>
+          <w:tcPr>
+            <w:tcW w:w="0" w:type="auto"/>
+            <w:shd w:val="clear" w:color="auto" w:fill="E2EFD9" w:themeFill="accent6" w:themeFillTint="33"/>
+            <w:hideMark/>
+          </w:tcPr>
+          <w:p>
+            <w:pPr>
+              <w:spacing w:before="40" w:after="40" w:line="259" w:lineRule="auto"/>
+              <w:rPr>
+                <w:rFonts w:ascii="Times New Roman" w:hAnsi="Times New Roman" w:cs="Times New Roman"/>
+                <w:sz w:val="20"/>
+                <w:szCs w:val="20"/>
+                <w:lang w:val="en-ID"/>
+              </w:rPr>
+            </w:pPr>
+            <w:r>
+              <w:rPr>
+                <w:rFonts w:ascii="Times New Roman" w:hAnsi="Times New Roman" w:cs="Times New Roman"/>
+                <w:sz w:val="20"/>
+                <w:szCs w:val="20"/>
+                <w:lang w:val="en-ID"/>
+              </w:rPr>
+              <w:t>Bermain</w:t>
+            </w:r>
+          </w:p>
+        </w:tc>
+        <w:tc>
+          <w:tcPr>
+            <w:tcW w:w="0" w:type="auto"/>
+            <w:gridSpan w:val="2"/>
+            <w:shd w:val="clear" w:color="auto" w:fill="E2EFD9" w:themeFill="accent6" w:themeFillTint="33"/>
+            <w:hideMark/>
+          </w:tcPr>
+          <w:p>
+            <w:pPr>
+              <w:spacing w:before="40" w:after="40" w:line="259" w:lineRule="auto"/>
+              <w:rPr>
+                <w:rFonts w:ascii="Times New Roman" w:hAnsi="Times New Roman" w:cs="Times New Roman"/>
+                <w:sz w:val="20"/>
+                <w:szCs w:val="20"/>
+                <w:lang w:val="en-ID"/>
+              </w:rPr>
+            </w:pPr>
+            <w:r>
+              <w:rPr>
+                <w:rFonts w:ascii="Times New Roman" w:hAnsi="Times New Roman" w:cs="Times New Roman"/>
+                <w:sz w:val="20"/>
+                <w:szCs w:val="20"/>
+                <w:lang w:val="en-ID"/>
+              </w:rPr>
+              <w:t>Pesan Tempat Bermain, Memulai Sesi Bermain, Countdown Waktu Bermain, Pengurangan Saldo Bermain, Countdown Berakhir</w:t>
+            </w:r>
+          </w:p>
+        </w:tc>
+        <w:tc>
+          <w:tcPr>
+            <w:tcW w:w="0" w:type="auto"/>
+            <w:hideMark/>
+          </w:tcPr>
+          <w:p>
+            <w:pPr>
+              <w:spacing w:before="40" w:after="40" w:line="259" w:lineRule="auto"/>
+              <w:jc w:val="center"/>
+              <w:rPr>
+                <w:rFonts w:ascii="Times New Roman" w:hAnsi="Times New Roman" w:cs="Times New Roman"/>
+                <w:b/>
+                <w:bCs/>
+                <w:sz w:val="20"/>
+                <w:szCs w:val="20"/>
+                <w:lang w:val="en-ID"/>
+              </w:rPr>
+            </w:pPr>
+            <w:r>
+              <w:rPr>
+                <w:rFonts w:ascii="Times New Roman" w:hAnsi="Times New Roman" w:cs="Times New Roman"/>
+                <w:b/>
+                <w:bCs/>
+                <w:sz w:val="20"/>
+                <w:szCs w:val="20"/>
+                <w:lang w:val="en-ID"/>
+              </w:rPr>
+              <w:t>Pass</w:t>
+            </w:r>
+          </w:p>
+        </w:tc>
+      </w:tr>
+      <w:tr>
+        <w:tc>
+          <w:tcPr>
+            <w:tcW w:w="0" w:type="auto"/>
+            <w:shd w:val="clear" w:color="auto" w:fill="FFFF00"/>
+            <w:hideMark/>
+          </w:tcPr>
+          <w:p>
+            <w:pPr>
+              <w:spacing w:before="40" w:after="40" w:line="259" w:lineRule="auto"/>
+              <w:rPr>
+                <w:rFonts w:ascii="Times New Roman" w:hAnsi="Times New Roman" w:cs="Times New Roman"/>
+                <w:sz w:val="20"/>
+                <w:szCs w:val="20"/>
+                <w:lang w:val="en-ID"/>
+              </w:rPr>
+            </w:pPr>
+            <w:r>
+              <w:rPr>
+                <w:rFonts w:ascii="Times New Roman" w:hAnsi="Times New Roman" w:cs="Times New Roman"/>
+                <w:sz w:val="20"/>
+                <w:szCs w:val="20"/>
+                <w:lang w:val="en-ID"/>
+              </w:rPr>
+              <w:t>Makanan &amp; Minuman</w:t>
+            </w:r>
+          </w:p>
+        </w:tc>
+        <w:tc>
+          <w:tcPr>
+            <w:tcW w:w="0" w:type="auto"/>
+            <w:gridSpan w:val="2"/>
+            <w:shd w:val="clear" w:color="auto" w:fill="FFFF00"/>
+            <w:hideMark/>
+          </w:tcPr>
+          <w:p>
+            <w:pPr>
+              <w:spacing w:before="40" w:after="40" w:line="259" w:lineRule="auto"/>
+              <w:rPr>
+                <w:rFonts w:ascii="Times New Roman" w:hAnsi="Times New Roman" w:cs="Times New Roman"/>
+                <w:sz w:val="20"/>
+                <w:szCs w:val="20"/>
+                <w:lang w:val="en-ID"/>
+              </w:rPr>
+            </w:pPr>
+            <w:r>
+              <w:rPr>
+                <w:rFonts w:ascii="Times New Roman" w:hAnsi="Times New Roman" w:cs="Times New Roman"/>
+                <w:sz w:val="20"/>
+                <w:szCs w:val="20"/>
+                <w:lang w:val="en-ID"/>
+              </w:rPr>
+              <w:t>Menu Makanan &amp; Minuman, Pemrosesan Pesanan Makanan, Pengurangan Saldo Pembelian</w:t>
+            </w:r>
+          </w:p>
+        </w:tc>
+        <w:tc>
+          <w:tcPr>
+            <w:tcW w:w="0" w:type="auto"/>
+            <w:hideMark/>
+          </w:tcPr>
+          <w:p>
+            <w:pPr>
+              <w:spacing w:before="40" w:after="40" w:line="259" w:lineRule="auto"/>
+              <w:jc w:val="center"/>
+              <w:rPr>
+                <w:rFonts w:ascii="Times New Roman" w:hAnsi="Times New Roman" w:cs="Times New Roman"/>
+                <w:b/>
+                <w:bCs/>
+                <w:sz w:val="20"/>
+                <w:szCs w:val="20"/>
+                <w:lang w:val="en-ID"/>
+              </w:rPr>
+            </w:pPr>
+            <w:r>
+              <w:rPr>
+                <w:rFonts w:ascii="Times New Roman" w:hAnsi="Times New Roman" w:cs="Times New Roman"/>
+                <w:b/>
+                <w:bCs/>
+                <w:sz w:val="20"/>
+                <w:szCs w:val="20"/>
+                <w:lang w:val="en-ID"/>
+              </w:rPr>
+              <w:t>Pass</w:t>
+            </w:r>
+          </w:p>
+        </w:tc>
+      </w:tr>
+      <w:tr>
+        <w:tc>
+          <w:tcPr>
+            <w:tcW w:w="0" w:type="auto"/>
+            <w:shd w:val="clear" w:color="auto" w:fill="D5DCE4" w:themeFill="text2" w:themeFillTint="33"/>
+            <w:hideMark/>
+          </w:tcPr>
+          <w:p>
+            <w:pPr>
+              <w:spacing w:before="40" w:after="40" w:line="259" w:lineRule="auto"/>
+              <w:rPr>
+                <w:rFonts w:ascii="Times New Roman" w:hAnsi="Times New Roman" w:cs="Times New Roman"/>
+                <w:sz w:val="20"/>
+                <w:szCs w:val="20"/>
+                <w:lang w:val="en-ID"/>
+              </w:rPr>
+            </w:pPr>
+            <w:r>
+              <w:rPr>
+                <w:rFonts w:ascii="Times New Roman" w:hAnsi="Times New Roman" w:cs="Times New Roman"/>
+                <w:sz w:val="20"/>
+                <w:szCs w:val="20"/>
+                <w:lang w:val="en-ID"/>
+              </w:rPr>
+              <w:t>Top Up &amp; Pembayaran</w:t>
+            </w:r>
+          </w:p>
+        </w:tc>
+        <w:tc>
+          <w:tcPr>
+            <w:tcW w:w="0" w:type="auto"/>
+            <w:gridSpan w:val="2"/>
+            <w:shd w:val="clear" w:color="auto" w:fill="D5DCE4" w:themeFill="text2" w:themeFillTint="33"/>
+            <w:hideMark/>
+          </w:tcPr>
+          <w:p>
+            <w:pPr>
+              <w:spacing w:before="40" w:after="40" w:line="259" w:lineRule="auto"/>
+              <w:rPr>
+                <w:rFonts w:ascii="Times New Roman" w:hAnsi="Times New Roman" w:cs="Times New Roman"/>
+                <w:sz w:val="20"/>
+                <w:szCs w:val="20"/>
+                <w:lang w:val="en-ID"/>
+              </w:rPr>
+            </w:pPr>
+            <w:r>
+              <w:rPr>
+                <w:rFonts w:ascii="Times New Roman" w:hAnsi="Times New Roman" w:cs="Times New Roman"/>
+                <w:sz w:val="20"/>
+                <w:szCs w:val="20"/>
+                <w:lang w:val="en-ID"/>
+              </w:rPr>
+              <w:t>Top Up Saldo, Payment Gateway, Proses Pembayaran, Penambahan Saldo, Pembayaran Gagal</w:t>
+            </w:r>
+          </w:p>
+        </w:tc>
+        <w:tc>
+          <w:tcPr>
+            <w:tcW w:w="0" w:type="auto"/>
+            <w:hideMark/>
+          </w:tcPr>
+          <w:p>
+            <w:pPr>
+              <w:spacing w:before="40" w:after="40" w:line="259" w:lineRule="auto"/>
+              <w:jc w:val="center"/>
+              <w:rPr>
+                <w:rFonts w:ascii="Times New Roman" w:hAnsi="Times New Roman" w:cs="Times New Roman"/>
+                <w:b/>
+                <w:bCs/>
+                <w:sz w:val="20"/>
+                <w:szCs w:val="20"/>
+                <w:lang w:val="en-ID"/>
+              </w:rPr>
+            </w:pPr>
+            <w:r>
+              <w:rPr>
+                <w:rFonts w:ascii="Times New Roman" w:hAnsi="Times New Roman" w:cs="Times New Roman"/>
+                <w:b/>
+                <w:bCs/>
+                <w:sz w:val="20"/>
+                <w:szCs w:val="20"/>
+                <w:lang w:val="en-ID"/>
+              </w:rPr>
+              <w:t>Pass</w:t>
+            </w:r>
+          </w:p>
+        </w:tc>
+      </w:tr>
+      <w:tr>
+        <w:tc>
+          <w:tcPr>
+            <w:tcW w:w="0" w:type="auto"/>
+            <w:shd w:val="clear" w:color="auto" w:fill="FFCE3C"/>
+            <w:hideMark/>
+          </w:tcPr>
+          <w:p>
+            <w:pPr>
+              <w:spacing w:before="40" w:after="40" w:line="259" w:lineRule="auto"/>
+              <w:rPr>
+                <w:rFonts w:ascii="Times New Roman" w:hAnsi="Times New Roman" w:cs="Times New Roman"/>
+                <w:sz w:val="20"/>
+                <w:szCs w:val="20"/>
+                <w:lang w:val="en-ID"/>
+              </w:rPr>
+            </w:pPr>
+            <w:r>
+              <w:rPr>
+                <w:rFonts w:ascii="Times New Roman" w:hAnsi="Times New Roman" w:cs="Times New Roman"/>
+                <w:sz w:val="20"/>
+                <w:szCs w:val="20"/>
+                <w:lang w:val="en-ID"/>
+              </w:rPr>
+              <w:t>Transaksi</w:t>
+            </w:r>
+          </w:p>
+        </w:tc>
+        <w:tc>
+          <w:tcPr>
+            <w:tcW w:w="0" w:type="auto"/>
+            <w:gridSpan w:val="2"/>
+            <w:shd w:val="clear" w:color="auto" w:fill="FFCE3C"/>
+            <w:hideMark/>
+          </w:tcPr>
+          <w:p>
+            <w:pPr>
+              <w:spacing w:before="40" w:after="40" w:line="259" w:lineRule="auto"/>
+              <w:rPr>
+                <w:rFonts w:ascii="Times New Roman" w:hAnsi="Times New Roman" w:cs="Times New Roman"/>
+                <w:sz w:val="20"/>
+                <w:szCs w:val="20"/>
+                <w:lang w:val="en-ID"/>
+              </w:rPr>
+            </w:pPr>
+            <w:r>
+              <w:rPr>
+                <w:rFonts w:ascii="Times New Roman" w:hAnsi="Times New Roman" w:cs="Times New Roman"/>
+                <w:sz w:val="20"/>
+                <w:szCs w:val="20"/>
+                <w:lang w:val="en-ID"/>
+              </w:rPr>
+              <w:t>Riwayat Transaksi, Riwayat Transaksi Customer, Riwayat Transaksi Admin</w:t>
+            </w:r>
+          </w:p>
+        </w:tc>
+        <w:tc>
+          <w:tcPr>
+            <w:tcW w:w="0" w:type="auto"/>
+            <w:hideMark/>
+          </w:tcPr>
+          <w:p>
+            <w:pPr>
+              <w:spacing w:before="40" w:after="40" w:line="259" w:lineRule="auto"/>
+              <w:jc w:val="center"/>
+              <w:rPr>
+                <w:rFonts w:ascii="Times New Roman" w:hAnsi="Times New Roman" w:cs="Times New Roman"/>
+                <w:b/>
+                <w:bCs/>
+                <w:sz w:val="20"/>
+                <w:szCs w:val="20"/>
+                <w:lang w:val="en-ID"/>
+              </w:rPr>
+            </w:pPr>
+            <w:r>
+              <w:rPr>
+                <w:rFonts w:ascii="Times New Roman" w:hAnsi="Times New Roman" w:cs="Times New Roman"/>
+                <w:b/>
+                <w:bCs/>
+                <w:sz w:val="20"/>
+                <w:szCs w:val="20"/>
+                <w:lang w:val="en-ID"/>
+              </w:rPr>
+              <w:t>Pass</w:t>
+            </w:r>
+          </w:p>
+        </w:tc>
+      </w:tr>
+      <w:tr>
+        <w:tc>
+          <w:tcPr>
+            <w:tcW w:w="0" w:type="auto"/>
+            <w:shd w:val="clear" w:color="auto" w:fill="7CEB99"/>
+            <w:hideMark/>
+          </w:tcPr>
+          <w:p>
+            <w:pPr>
+              <w:spacing w:before="40" w:after="40" w:line="259" w:lineRule="auto"/>
+              <w:rPr>
+                <w:rFonts w:ascii="Times New Roman" w:hAnsi="Times New Roman" w:cs="Times New Roman"/>
+                <w:sz w:val="20"/>
+                <w:szCs w:val="20"/>
+                <w:lang w:val="en-ID"/>
+              </w:rPr>
+            </w:pPr>
+            <w:r>
+              <w:rPr>
+                <w:rFonts w:ascii="Times New Roman" w:hAnsi="Times New Roman" w:cs="Times New Roman"/>
+                <w:sz w:val="20"/>
+                <w:szCs w:val="20"/>
+                <w:lang w:val="en-ID"/>
+              </w:rPr>
+              <w:t>Laporan</w:t>
+            </w:r>
+          </w:p>
+        </w:tc>
+        <w:tc>
+          <w:tcPr>
+            <w:tcW w:w="0" w:type="auto"/>
+            <w:gridSpan w:val="2"/>
+            <w:shd w:val="clear" w:color="auto" w:fill="7CEB99"/>
+            <w:hideMark/>
+          </w:tcPr>
+          <w:p>
+            <w:pPr>
+              <w:spacing w:before="40" w:after="40" w:line="259" w:lineRule="auto"/>
+              <w:rPr>
+                <w:rFonts w:ascii="Times New Roman" w:hAnsi="Times New Roman" w:cs="Times New Roman"/>
+                <w:sz w:val="20"/>
+                <w:szCs w:val="20"/>
+                <w:lang w:val="en-ID"/>
+              </w:rPr>
+            </w:pPr>
+            <w:r>
+              <w:rPr>
+                <w:rFonts w:ascii="Times New Roman" w:hAnsi="Times New Roman" w:cs="Times New Roman"/>
+                <w:sz w:val="20"/>
+                <w:szCs w:val="20"/>
+                <w:lang w:val="en-ID"/>
+              </w:rPr>
+              <w:t>Laporan Transaksi, Laporan Keuangan, Ringkasan Laporan Transaksi, Download Laporan</w:t>
+            </w:r>
+          </w:p>
+        </w:tc>
+        <w:tc>
+          <w:tcPr>
+            <w:tcW w:w="0" w:type="auto"/>
+            <w:hideMark/>
+          </w:tcPr>
+          <w:p>
+            <w:pPr>
+              <w:spacing w:before="40" w:after="40" w:line="259" w:lineRule="auto"/>
+              <w:jc w:val="center"/>
+              <w:rPr>
+                <w:rFonts w:ascii="Times New Roman" w:hAnsi="Times New Roman" w:cs="Times New Roman"/>
+                <w:b/>
+                <w:bCs/>
+                <w:sz w:val="20"/>
+                <w:szCs w:val="20"/>
+                <w:lang w:val="en-ID"/>
+              </w:rPr>
+            </w:pPr>
+            <w:r>
+              <w:rPr>
+                <w:rFonts w:ascii="Times New Roman" w:hAnsi="Times New Roman" w:cs="Times New Roman"/>
+                <w:b/>
+                <w:bCs/>
+                <w:sz w:val="20"/>
+                <w:szCs w:val="20"/>
+                <w:lang w:val="en-ID"/>
+              </w:rPr>
+              <w:t>Pass</w:t>
+            </w:r>
+          </w:p>
+        </w:tc>
+      </w:tr>
+      <w:tr>
+        <w:tc>
+          <w:tcPr>
+            <w:tcW w:w="0" w:type="auto"/>
+            <w:shd w:val="clear" w:color="auto" w:fill="F6C3FF"/>
+            <w:hideMark/>
+          </w:tcPr>
+          <w:p>
+            <w:pPr>
+              <w:spacing w:before="40" w:after="40" w:line="259" w:lineRule="auto"/>
+              <w:rPr>
+                <w:rFonts w:ascii="Times New Roman" w:hAnsi="Times New Roman" w:cs="Times New Roman"/>
+                <w:sz w:val="20"/>
+                <w:szCs w:val="20"/>
+                <w:lang w:val="en-ID"/>
+              </w:rPr>
+            </w:pPr>
+            <w:r>
+              <w:rPr>
+                <w:rFonts w:ascii="Times New Roman" w:hAnsi="Times New Roman" w:cs="Times New Roman"/>
+                <w:sz w:val="20"/>
+                <w:szCs w:val="20"/>
+                <w:lang w:val="en-ID"/>
+              </w:rPr>
+              <w:t>Administrasi</w:t>
+            </w:r>
+          </w:p>
+        </w:tc>
+        <w:tc>
+          <w:tcPr>
+            <w:tcW w:w="0" w:type="auto"/>
+            <w:gridSpan w:val="2"/>
+            <w:shd w:val="clear" w:color="auto" w:fill="F6C3FF"/>
+            <w:hideMark/>
+          </w:tcPr>
+          <w:p>
+            <w:pPr>
+              <w:spacing w:before="40" w:after="40" w:line="259" w:lineRule="auto"/>
+              <w:rPr>
+                <w:rFonts w:ascii="Times New Roman" w:hAnsi="Times New Roman" w:cs="Times New Roman"/>
+                <w:sz w:val="20"/>
+                <w:szCs w:val="20"/>
+                <w:lang w:val="en-ID"/>
+              </w:rPr>
+            </w:pPr>
+            <w:r>
+              <w:rPr>
+                <w:rFonts w:ascii="Times New Roman" w:hAnsi="Times New Roman" w:cs="Times New Roman"/>
+                <w:sz w:val="20"/>
+                <w:szCs w:val="20"/>
+                <w:lang w:val="en-ID"/>
+              </w:rPr>
+              <w:t>Kelola Akun Customer, Kelola Akun oleh Admin</w:t>
+            </w:r>
+          </w:p>
+        </w:tc>
+        <w:tc>
+          <w:tcPr>
+            <w:tcW w:w="0" w:type="auto"/>
+            <w:hideMark/>
+          </w:tcPr>
+          <w:p>
+            <w:pPr>
+              <w:spacing w:before="40" w:after="40" w:line="259" w:lineRule="auto"/>
+              <w:jc w:val="center"/>
+              <w:rPr>
+                <w:rFonts w:ascii="Times New Roman" w:hAnsi="Times New Roman" w:cs="Times New Roman"/>
+                <w:b/>
+                <w:bCs/>
+                <w:sz w:val="20"/>
+                <w:szCs w:val="20"/>
+                <w:lang w:val="en-ID"/>
+              </w:rPr>
+            </w:pPr>
+            <w:r>
+              <w:rPr>
+                <w:rFonts w:ascii="Times New Roman" w:hAnsi="Times New Roman" w:cs="Times New Roman"/>
+                <w:b/>
+                <w:bCs/>
+                <w:sz w:val="20"/>
+                <w:szCs w:val="20"/>
+                <w:lang w:val="en-ID"/>
+              </w:rPr>
+              <w:t>Pass</w:t>
+            </w:r>
+          </w:p>
+        </w:tc>
+      </w:tr>
+      <w:tr>
+        <w:tc>
+          <w:tcPr>
+            <w:tcW w:w="0" w:type="auto"/>
+            <w:shd w:val="clear" w:color="auto" w:fill="FFC6C6"/>
+            <w:hideMark/>
+          </w:tcPr>
+          <w:p>
+            <w:pPr>
+              <w:spacing w:before="40" w:after="40" w:line="259" w:lineRule="auto"/>
+              <w:rPr>
+                <w:rFonts w:ascii="Times New Roman" w:hAnsi="Times New Roman" w:cs="Times New Roman"/>
+                <w:sz w:val="20"/>
+                <w:szCs w:val="20"/>
+                <w:lang w:val="en-ID"/>
+              </w:rPr>
+            </w:pPr>
+            <w:r>
+              <w:rPr>
+                <w:rFonts w:ascii="Times New Roman" w:hAnsi="Times New Roman" w:cs="Times New Roman"/>
+                <w:sz w:val="20"/>
+                <w:szCs w:val="20"/>
+                <w:lang w:val="en-ID"/>
+              </w:rPr>
+              <w:t>Monitoring</w:t>
+            </w:r>
+          </w:p>
+        </w:tc>
+        <w:tc>
+          <w:tcPr>
+            <w:tcW w:w="0" w:type="auto"/>
+            <w:gridSpan w:val="2"/>
+            <w:shd w:val="clear" w:color="auto" w:fill="FFC6C6"/>
+            <w:hideMark/>
+          </w:tcPr>
+          <w:p>
+            <w:pPr>
+              <w:spacing w:before="40" w:after="40" w:line="259" w:lineRule="auto"/>
+              <w:rPr>
+                <w:rFonts w:ascii="Times New Roman" w:hAnsi="Times New Roman" w:cs="Times New Roman"/>
+                <w:sz w:val="20"/>
+                <w:szCs w:val="20"/>
+                <w:lang w:val="en-ID"/>
+              </w:rPr>
+            </w:pPr>
+            <w:r>
+              <w:rPr>
+                <w:rFonts w:ascii="Times New Roman" w:hAnsi="Times New Roman" w:cs="Times New Roman"/>
+                <w:sz w:val="20"/>
+                <w:szCs w:val="20"/>
+                <w:lang w:val="en-ID"/>
+              </w:rPr>
+              <w:t>Monitoring Status PC, Informasi Sesi PC</w:t>
+            </w:r>
+          </w:p>
+        </w:tc>
+        <w:tc>
+          <w:tcPr>
+            <w:tcW w:w="0" w:type="auto"/>
+            <w:hideMark/>
+          </w:tcPr>
+          <w:p>
+            <w:pPr>
+              <w:spacing w:before="40" w:after="40" w:line="259" w:lineRule="auto"/>
+              <w:jc w:val="center"/>
+              <w:rPr>
+                <w:rFonts w:ascii="Times New Roman" w:hAnsi="Times New Roman" w:cs="Times New Roman"/>
+                <w:b/>
+                <w:bCs/>
+                <w:sz w:val="20"/>
+                <w:szCs w:val="20"/>
+                <w:lang w:val="en-ID"/>
+              </w:rPr>
+            </w:pPr>
+            <w:r>
+              <w:rPr>
+                <w:rFonts w:ascii="Times New Roman" w:hAnsi="Times New Roman" w:cs="Times New Roman"/>
+                <w:b/>
+                <w:bCs/>
+                <w:sz w:val="20"/>
+                <w:szCs w:val="20"/>
+                <w:lang w:val="en-ID"/>
+              </w:rPr>
+              <w:t>Pass</w:t>
+            </w:r>
+          </w:p>
+        </w:tc>
+      </w:tr>
+      <w:tr>
+        <w:tc>
+          <w:tcPr>
+            <w:tcW w:w="0" w:type="auto"/>
+            <w:shd w:val="clear" w:color="auto" w:fill="76E3FF"/>
+            <w:hideMark/>
+          </w:tcPr>
+          <w:p>
+            <w:pPr>
+              <w:spacing w:before="40" w:after="40" w:line="259" w:lineRule="auto"/>
+              <w:rPr>
+                <w:rFonts w:ascii="Times New Roman" w:hAnsi="Times New Roman" w:cs="Times New Roman"/>
+                <w:sz w:val="20"/>
+                <w:szCs w:val="20"/>
+                <w:lang w:val="en-ID"/>
+              </w:rPr>
+            </w:pPr>
+            <w:r>
+              <w:rPr>
+                <w:rFonts w:ascii="Times New Roman" w:hAnsi="Times New Roman" w:cs="Times New Roman"/>
+                <w:sz w:val="20"/>
+                <w:szCs w:val="20"/>
+                <w:lang w:val="en-ID"/>
+              </w:rPr>
+              <w:t>Validasi Sistem</w:t>
+            </w:r>
+          </w:p>
+        </w:tc>
+        <w:tc>
+          <w:tcPr>
+            <w:tcW w:w="0" w:type="auto"/>
+            <w:gridSpan w:val="2"/>
+            <w:shd w:val="clear" w:color="auto" w:fill="76E3FF"/>
+            <w:hideMark/>
+          </w:tcPr>
+          <w:p>
+            <w:pPr>
+              <w:spacing w:before="40" w:after="40" w:line="259" w:lineRule="auto"/>
+              <w:rPr>
+                <w:rFonts w:ascii="Times New Roman" w:hAnsi="Times New Roman" w:cs="Times New Roman"/>
+                <w:sz w:val="20"/>
+                <w:szCs w:val="20"/>
+                <w:lang w:val="en-ID"/>
+              </w:rPr>
+            </w:pPr>
+            <w:r>
+              <w:rPr>
+                <w:rFonts w:ascii="Times New Roman" w:hAnsi="Times New Roman" w:cs="Times New Roman"/>
+                <w:sz w:val="20"/>
+                <w:szCs w:val="20"/>
+                <w:lang w:val="en-ID"/>
+              </w:rPr>
+              <w:t>Saldo Tidak Cukup</w:t>
+            </w:r>
+          </w:p>
+        </w:tc>
+        <w:tc>
+          <w:tcPr>
+            <w:tcW w:w="0" w:type="auto"/>
+            <w:hideMark/>
+          </w:tcPr>
+          <w:p>
+            <w:pPr>
+              <w:spacing w:before="40" w:after="40" w:line="259" w:lineRule="auto"/>
+              <w:jc w:val="center"/>
+              <w:rPr>
+                <w:rFonts w:ascii="Times New Roman" w:hAnsi="Times New Roman" w:cs="Times New Roman"/>
+                <w:b/>
+                <w:bCs/>
+                <w:sz w:val="20"/>
+                <w:szCs w:val="20"/>
+                <w:lang w:val="en-ID"/>
+              </w:rPr>
+            </w:pPr>
+            <w:r>
+              <w:rPr>
+                <w:rFonts w:ascii="Times New Roman" w:hAnsi="Times New Roman" w:cs="Times New Roman"/>
+                <w:b/>
+                <w:bCs/>
+                <w:sz w:val="20"/>
+                <w:szCs w:val="20"/>
+                <w:lang w:val="en-ID"/>
+              </w:rPr>
+              <w:t>Pass</w:t>
+            </w:r>
+          </w:p>
+        </w:tc>
+      </w:tr>
+      <w:tr>
+        <w:tc>
+          <w:tcPr>
+            <w:tcW w:w="0" w:type="auto"/>
+            <w:shd w:val="clear" w:color="auto" w:fill="D9D9D9" w:themeFill="background1" w:themeFillShade="D9"/>
+            <w:hideMark/>
+          </w:tcPr>
+          <w:p>
+            <w:pPr>
+              <w:spacing w:beforeLines="40" w:before="96" w:afterLines="40" w:after="96" w:line="259" w:lineRule="auto"/>
+              <w:jc w:val="center"/>
+              <w:rPr>
+                <w:rFonts w:ascii="Times New Roman" w:hAnsi="Times New Roman" w:cs="Times New Roman"/>
+                <w:b/>
+                <w:bCs/>
+                <w:sz w:val="20"/>
+                <w:szCs w:val="20"/>
+                <w:lang w:val="en-ID"/>
+              </w:rPr>
+            </w:pPr>
+            <w:r>
+              <w:rPr>
+                <w:rFonts w:ascii="Times New Roman" w:hAnsi="Times New Roman" w:cs="Times New Roman"/>
+                <w:b/>
+                <w:bCs/>
+                <w:sz w:val="20"/>
+                <w:szCs w:val="20"/>
+                <w:lang w:val="en-ID"/>
+              </w:rPr>
+              <w:t>Fitur</w:t>
+            </w:r>
+          </w:p>
+        </w:tc>
+        <w:tc>
+          <w:tcPr>
+            <w:tcW w:w="0" w:type="auto"/>
+            <w:shd w:val="clear" w:color="auto" w:fill="D9D9D9" w:themeFill="background1" w:themeFillShade="D9"/>
+            <w:hideMark/>
+          </w:tcPr>
+          <w:p>
+            <w:pPr>
+              <w:spacing w:beforeLines="40" w:before="96" w:afterLines="40" w:after="96" w:line="259" w:lineRule="auto"/>
+              <w:jc w:val="center"/>
+              <w:rPr>
+                <w:rFonts w:ascii="Times New Roman" w:hAnsi="Times New Roman" w:cs="Times New Roman"/>
+                <w:b/>
+                <w:bCs/>
+                <w:sz w:val="20"/>
+                <w:szCs w:val="20"/>
+                <w:lang w:val="en-ID"/>
+              </w:rPr>
+            </w:pPr>
+            <w:r>
+              <w:rPr>
+                <w:rFonts w:ascii="Times New Roman" w:hAnsi="Times New Roman" w:cs="Times New Roman"/>
+                <w:b/>
+                <w:bCs/>
+                <w:sz w:val="20"/>
+                <w:szCs w:val="20"/>
+                <w:lang w:val="en-ID"/>
+              </w:rPr>
+              <w:t>Test Case / Cara Kerja</w:t>
+            </w:r>
+          </w:p>
+        </w:tc>
+        <w:tc>
+          <w:tcPr>
+            <w:tcW w:w="2233" w:type="dxa"/>
+            <w:shd w:val="clear" w:color="auto" w:fill="D9D9D9" w:themeFill="background1" w:themeFillShade="D9"/>
+            <w:hideMark/>
+          </w:tcPr>
+          <w:p>
+            <w:pPr>
+              <w:spacing w:beforeLines="40" w:before="96" w:afterLines="40" w:after="96" w:line="259" w:lineRule="auto"/>
+              <w:jc w:val="center"/>
+              <w:rPr>
+                <w:rFonts w:ascii="Times New Roman" w:hAnsi="Times New Roman" w:cs="Times New Roman"/>
+                <w:b/>
+                <w:bCs/>
+                <w:sz w:val="20"/>
+                <w:szCs w:val="20"/>
+                <w:lang w:val="en-ID"/>
+              </w:rPr>
+            </w:pPr>
+            <w:r>
+              <w:rPr>
+                <w:rFonts w:ascii="Times New Roman" w:hAnsi="Times New Roman" w:cs="Times New Roman"/>
+                <w:b/>
+                <w:bCs/>
+                <w:sz w:val="20"/>
+                <w:szCs w:val="20"/>
+                <w:lang w:val="en-ID"/>
+              </w:rPr>
+              <w:t>Data</w:t>
+            </w:r>
+          </w:p>
+        </w:tc>
+        <w:tc>
+          <w:tcPr>
+            <w:tcW w:w="1224" w:type="dxa"/>
+            <w:shd w:val="clear" w:color="auto" w:fill="D9D9D9" w:themeFill="background1" w:themeFillShade="D9"/>
+            <w:hideMark/>
+          </w:tcPr>
+          <w:p>
+            <w:pPr>
+              <w:spacing w:beforeLines="40" w:before="96" w:afterLines="40" w:after="96" w:line="259" w:lineRule="auto"/>
+              <w:jc w:val="center"/>
+              <w:rPr>
+                <w:rFonts w:ascii="Times New Roman" w:hAnsi="Times New Roman" w:cs="Times New Roman"/>
+                <w:b/>
+                <w:bCs/>
+                <w:sz w:val="20"/>
+                <w:szCs w:val="20"/>
+                <w:lang w:val="en-ID"/>
+              </w:rPr>
+            </w:pPr>
+            <w:r>
+              <w:rPr>
+                <w:rFonts w:ascii="Times New Roman" w:hAnsi="Times New Roman" w:cs="Times New Roman"/>
+                <w:b/>
+                <w:bCs/>
+                <w:sz w:val="20"/>
+                <w:szCs w:val="20"/>
+                <w:lang w:val="en-ID"/>
+              </w:rPr>
+              <w:t>Status</w:t>
+            </w:r>
+          </w:p>
+        </w:tc>
+      </w:tr>
+      <w:tr>
+        <w:tc>
+          <w:tcPr>
+            <w:tcW w:w="0" w:type="auto"/>
+            <w:shd w:val="clear" w:color="auto" w:fill="DEEAF6" w:themeFill="accent5" w:themeFillTint="33"/>
           </w:tcPr>
           <w:p>
             <w:pPr>
@@ -237,7 +1218,25 @@
                 <w:szCs w:val="20"/>
                 <w:lang w:val="en-ID"/>
               </w:rPr>
-              <w:t>User membuat akun dan sistem akan memvalidasi apakah username tersebut  available</w:t>
+              <w:t>User membuat akun dan sistem akan memvalidasi apakah username tersebut</w:t>
+            </w:r>
+            <w:r>
+              <w:rPr>
+                <w:rFonts w:ascii="Times New Roman" w:hAnsi="Times New Roman" w:cs="Times New Roman"/>
+                <w:sz w:val="20"/>
+                <w:szCs w:val="20"/>
+                <w:lang w:val="en-ID"/>
+              </w:rPr>
+              <w:t xml:space="preserve"> </w:t>
+            </w:r>
+            <w:r>
+              <w:rPr>
+                <w:rFonts w:ascii="Times New Roman" w:hAnsi="Times New Roman" w:cs="Times New Roman"/>
+                <w:sz w:val="20"/>
+                <w:szCs w:val="20"/>
+                <w:lang w:val="en-ID"/>
+              </w:rPr>
+              <w:t>available</w:t>
             </w:r>
           </w:p>
         </w:tc>
@@ -303,6 +1302,7 @@
         <w:tc>
           <w:tcPr>
             <w:tcW w:w="0" w:type="auto"/>
+            <w:shd w:val="clear" w:color="auto" w:fill="DEEAF6" w:themeFill="accent5" w:themeFillTint="33"/>
             <w:hideMark/>
           </w:tcPr>
           <w:p>
@@ -412,6 +1412,7 @@
         <w:tc>
           <w:tcPr>
             <w:tcW w:w="0" w:type="auto"/>
+            <w:shd w:val="clear" w:color="auto" w:fill="DEEAF6" w:themeFill="accent5" w:themeFillTint="33"/>
             <w:hideMark/>
           </w:tcPr>
           <w:p>
@@ -521,92 +1522,91 @@
         <w:tc>
           <w:tcPr>
             <w:tcW w:w="0" w:type="auto"/>
-            <w:hideMark/>
-          </w:tcPr>
-          <w:p>
-            <w:pPr>
-              <w:spacing w:beforeLines="20" w:before="48" w:afterLines="20" w:after="48" w:line="259" w:lineRule="auto"/>
-              <w:rPr>
-                <w:rFonts w:ascii="Times New Roman" w:hAnsi="Times New Roman" w:cs="Times New Roman"/>
-                <w:sz w:val="20"/>
-                <w:szCs w:val="20"/>
-                <w:lang w:val="en-ID"/>
-              </w:rPr>
-            </w:pPr>
-            <w:r>
-              <w:rPr>
-                <w:rFonts w:ascii="Times New Roman" w:hAnsi="Times New Roman" w:cs="Times New Roman"/>
-                <w:sz w:val="20"/>
-                <w:szCs w:val="20"/>
-                <w:lang w:val="en-ID"/>
-              </w:rPr>
-              <w:t>Dashboard</w:t>
-            </w:r>
-          </w:p>
-        </w:tc>
-        <w:tc>
-          <w:tcPr>
-            <w:tcW w:w="0" w:type="auto"/>
-            <w:hideMark/>
-          </w:tcPr>
-          <w:p>
-            <w:pPr>
-              <w:spacing w:beforeLines="20" w:before="48" w:afterLines="20" w:after="48" w:line="259" w:lineRule="auto"/>
-              <w:rPr>
-                <w:rFonts w:ascii="Times New Roman" w:hAnsi="Times New Roman" w:cs="Times New Roman"/>
-                <w:sz w:val="20"/>
-                <w:szCs w:val="20"/>
-                <w:lang w:val="en-ID"/>
-              </w:rPr>
-            </w:pPr>
-            <w:r>
-              <w:rPr>
-                <w:rFonts w:ascii="Times New Roman" w:hAnsi="Times New Roman" w:cs="Times New Roman"/>
-                <w:sz w:val="20"/>
-                <w:szCs w:val="20"/>
-                <w:lang w:val="en-ID"/>
-              </w:rPr>
-              <w:t>Sistem menampilkan dashboard setelah login berhasil</w:t>
+            <w:shd w:val="clear" w:color="auto" w:fill="DEEAF6" w:themeFill="accent5" w:themeFillTint="33"/>
+          </w:tcPr>
+          <w:p>
+            <w:pPr>
+              <w:spacing w:beforeLines="20" w:before="48" w:afterLines="20" w:after="48"/>
+              <w:rPr>
+                <w:rFonts w:ascii="Times New Roman" w:hAnsi="Times New Roman" w:cs="Times New Roman"/>
+                <w:sz w:val="20"/>
+                <w:szCs w:val="20"/>
+                <w:lang w:val="en-ID"/>
+              </w:rPr>
+            </w:pPr>
+            <w:r>
+              <w:rPr>
+                <w:rFonts w:ascii="Times New Roman" w:hAnsi="Times New Roman" w:cs="Times New Roman"/>
+                <w:sz w:val="20"/>
+                <w:szCs w:val="20"/>
+                <w:lang w:val="en-ID"/>
+              </w:rPr>
+              <w:t>Error Login</w:t>
+            </w:r>
+          </w:p>
+        </w:tc>
+        <w:tc>
+          <w:tcPr>
+            <w:tcW w:w="0" w:type="auto"/>
+          </w:tcPr>
+          <w:p>
+            <w:pPr>
+              <w:spacing w:beforeLines="20" w:before="48" w:afterLines="20" w:after="48"/>
+              <w:rPr>
+                <w:rFonts w:ascii="Times New Roman" w:hAnsi="Times New Roman" w:cs="Times New Roman"/>
+                <w:sz w:val="20"/>
+                <w:szCs w:val="20"/>
+                <w:lang w:val="en-ID"/>
+              </w:rPr>
+            </w:pPr>
+            <w:r>
+              <w:rPr>
+                <w:rFonts w:ascii="Times New Roman" w:hAnsi="Times New Roman" w:cs="Times New Roman"/>
+                <w:sz w:val="20"/>
+                <w:szCs w:val="20"/>
+                <w:lang w:val="en-ID"/>
+              </w:rPr>
+              <w:t>Sistem menampilkan pesan error jika login gagal</w:t>
             </w:r>
           </w:p>
         </w:tc>
         <w:tc>
           <w:tcPr>
             <w:tcW w:w="2233" w:type="dxa"/>
-            <w:hideMark/>
-          </w:tcPr>
-          <w:p>
-            <w:pPr>
-              <w:spacing w:beforeLines="20" w:before="48" w:afterLines="20" w:after="48" w:line="259" w:lineRule="auto"/>
-              <w:rPr>
-                <w:rFonts w:ascii="Times New Roman" w:hAnsi="Times New Roman" w:cs="Times New Roman"/>
-                <w:sz w:val="20"/>
-                <w:szCs w:val="20"/>
-                <w:lang w:val="en-ID"/>
-              </w:rPr>
-            </w:pPr>
-            <w:r>
-              <w:rPr>
-                <w:rFonts w:ascii="Times New Roman" w:hAnsi="Times New Roman" w:cs="Times New Roman"/>
-                <w:sz w:val="20"/>
-                <w:szCs w:val="20"/>
-                <w:lang w:val="en-ID"/>
-              </w:rPr>
-              <w:t>Data akun user</w:t>
+          </w:tcPr>
+          <w:p>
+            <w:pPr>
+              <w:spacing w:beforeLines="20" w:before="48" w:afterLines="20" w:after="48"/>
+              <w:rPr>
+                <w:rFonts w:ascii="Times New Roman" w:hAnsi="Times New Roman" w:cs="Times New Roman"/>
+                <w:sz w:val="20"/>
+                <w:szCs w:val="20"/>
+                <w:lang w:val="en-ID"/>
+              </w:rPr>
+            </w:pPr>
+            <w:r>
+              <w:rPr>
+                <w:rFonts w:ascii="Times New Roman" w:hAnsi="Times New Roman" w:cs="Times New Roman"/>
+                <w:sz w:val="20"/>
+                <w:szCs w:val="20"/>
+                <w:lang w:val="en-ID"/>
+              </w:rPr>
+              <w:t>Username/Password salah</w:t>
             </w:r>
           </w:p>
         </w:tc>
         <w:tc>
           <w:tcPr>
             <w:tcW w:w="1224" w:type="dxa"/>
-            <w:hideMark/>
-          </w:tcPr>
-          <w:p>
-            <w:pPr>
-              <w:spacing w:beforeLines="20" w:before="48" w:afterLines="20" w:after="48" w:line="259" w:lineRule="auto"/>
+          </w:tcPr>
+          <w:p>
+            <w:pPr>
+              <w:spacing w:beforeLines="20" w:before="48" w:afterLines="20" w:after="48"/>
               <w:jc w:val="center"/>
               <w:rPr>
                 <w:rFonts w:ascii="Times New Roman" w:hAnsi="Times New Roman" w:cs="Times New Roman"/>
+                <w:b/>
+                <w:bCs/>
                 <w:sz w:val="20"/>
                 <w:szCs w:val="20"/>
                 <w:lang w:val="en-ID"/>
@@ -630,52 +1630,53 @@
         <w:tc>
           <w:tcPr>
             <w:tcW w:w="0" w:type="auto"/>
-            <w:hideMark/>
-          </w:tcPr>
-          <w:p>
-            <w:pPr>
-              <w:spacing w:beforeLines="20" w:before="48" w:afterLines="20" w:after="48" w:line="259" w:lineRule="auto"/>
-              <w:rPr>
-                <w:rFonts w:ascii="Times New Roman" w:hAnsi="Times New Roman" w:cs="Times New Roman"/>
-                <w:sz w:val="20"/>
-                <w:szCs w:val="20"/>
-                <w:lang w:val="en-ID"/>
-              </w:rPr>
-            </w:pPr>
-            <w:r>
-              <w:rPr>
-                <w:rFonts w:ascii="Times New Roman" w:hAnsi="Times New Roman" w:cs="Times New Roman"/>
-                <w:sz w:val="20"/>
-                <w:szCs w:val="20"/>
-                <w:lang w:val="en-ID"/>
-              </w:rPr>
-              <w:t>Saldo Koin</w:t>
-            </w:r>
-          </w:p>
-        </w:tc>
-        <w:tc>
-          <w:tcPr>
-            <w:tcW w:w="0" w:type="auto"/>
-            <w:hideMark/>
-          </w:tcPr>
-          <w:p>
-            <w:pPr>
-              <w:spacing w:beforeLines="20" w:before="48" w:afterLines="20" w:after="48" w:line="259" w:lineRule="auto"/>
-              <w:rPr>
-                <w:rFonts w:ascii="Times New Roman" w:hAnsi="Times New Roman" w:cs="Times New Roman"/>
-                <w:sz w:val="20"/>
-                <w:szCs w:val="20"/>
-                <w:lang w:val="en-ID"/>
-              </w:rPr>
-            </w:pPr>
-            <w:r>
-              <w:rPr>
-                <w:rFonts w:ascii="Times New Roman" w:hAnsi="Times New Roman" w:cs="Times New Roman"/>
-                <w:sz w:val="20"/>
-                <w:szCs w:val="20"/>
-                <w:lang w:val="en-ID"/>
-              </w:rPr>
-              <w:t>Sistem menampilkan saldo customer secara real-time</w:t>
+            <w:shd w:val="clear" w:color="auto" w:fill="FBE4D5" w:themeFill="accent2" w:themeFillTint="33"/>
+            <w:hideMark/>
+          </w:tcPr>
+          <w:p>
+            <w:pPr>
+              <w:spacing w:beforeLines="20" w:before="48" w:afterLines="20" w:after="48" w:line="259" w:lineRule="auto"/>
+              <w:rPr>
+                <w:rFonts w:ascii="Times New Roman" w:hAnsi="Times New Roman" w:cs="Times New Roman"/>
+                <w:sz w:val="20"/>
+                <w:szCs w:val="20"/>
+                <w:lang w:val="en-ID"/>
+              </w:rPr>
+            </w:pPr>
+            <w:r>
+              <w:rPr>
+                <w:rFonts w:ascii="Times New Roman" w:hAnsi="Times New Roman" w:cs="Times New Roman"/>
+                <w:sz w:val="20"/>
+                <w:szCs w:val="20"/>
+                <w:lang w:val="en-ID"/>
+              </w:rPr>
+              <w:t>Dashboard</w:t>
+            </w:r>
+          </w:p>
+        </w:tc>
+        <w:tc>
+          <w:tcPr>
+            <w:tcW w:w="0" w:type="auto"/>
+            <w:hideMark/>
+          </w:tcPr>
+          <w:p>
+            <w:pPr>
+              <w:spacing w:beforeLines="20" w:before="48" w:afterLines="20" w:after="48" w:line="259" w:lineRule="auto"/>
+              <w:rPr>
+                <w:rFonts w:ascii="Times New Roman" w:hAnsi="Times New Roman" w:cs="Times New Roman"/>
+                <w:sz w:val="20"/>
+                <w:szCs w:val="20"/>
+                <w:lang w:val="en-ID"/>
+              </w:rPr>
+            </w:pPr>
+            <w:r>
+              <w:rPr>
+                <w:rFonts w:ascii="Times New Roman" w:hAnsi="Times New Roman" w:cs="Times New Roman"/>
+                <w:sz w:val="20"/>
+                <w:szCs w:val="20"/>
+                <w:lang w:val="en-ID"/>
+              </w:rPr>
+              <w:t>Sistem menampilkan dashboard setelah login berhasil</w:t>
             </w:r>
           </w:p>
         </w:tc>
@@ -701,7 +1702,7 @@
                 <w:szCs w:val="20"/>
                 <w:lang w:val="en-ID"/>
               </w:rPr>
-              <w:t>Data saldo customer</w:t>
+              <w:t>Data akun user</w:t>
             </w:r>
           </w:p>
         </w:tc>
@@ -739,52 +1740,53 @@
         <w:tc>
           <w:tcPr>
             <w:tcW w:w="0" w:type="auto"/>
-            <w:hideMark/>
-          </w:tcPr>
-          <w:p>
-            <w:pPr>
-              <w:spacing w:beforeLines="20" w:before="48" w:afterLines="20" w:after="48" w:line="259" w:lineRule="auto"/>
-              <w:rPr>
-                <w:rFonts w:ascii="Times New Roman" w:hAnsi="Times New Roman" w:cs="Times New Roman"/>
-                <w:sz w:val="20"/>
-                <w:szCs w:val="20"/>
-                <w:lang w:val="en-ID"/>
-              </w:rPr>
-            </w:pPr>
-            <w:r>
-              <w:rPr>
-                <w:rFonts w:ascii="Times New Roman" w:hAnsi="Times New Roman" w:cs="Times New Roman"/>
-                <w:sz w:val="20"/>
-                <w:szCs w:val="20"/>
-                <w:lang w:val="en-ID"/>
-              </w:rPr>
-              <w:t>Status Bermain</w:t>
-            </w:r>
-          </w:p>
-        </w:tc>
-        <w:tc>
-          <w:tcPr>
-            <w:tcW w:w="0" w:type="auto"/>
-            <w:hideMark/>
-          </w:tcPr>
-          <w:p>
-            <w:pPr>
-              <w:spacing w:beforeLines="20" w:before="48" w:afterLines="20" w:after="48" w:line="259" w:lineRule="auto"/>
-              <w:rPr>
-                <w:rFonts w:ascii="Times New Roman" w:hAnsi="Times New Roman" w:cs="Times New Roman"/>
-                <w:sz w:val="20"/>
-                <w:szCs w:val="20"/>
-                <w:lang w:val="en-ID"/>
-              </w:rPr>
-            </w:pPr>
-            <w:r>
-              <w:rPr>
-                <w:rFonts w:ascii="Times New Roman" w:hAnsi="Times New Roman" w:cs="Times New Roman"/>
-                <w:sz w:val="20"/>
-                <w:szCs w:val="20"/>
-                <w:lang w:val="en-ID"/>
-              </w:rPr>
-              <w:t>Sistem menampilkan status bermain customer</w:t>
+            <w:shd w:val="clear" w:color="auto" w:fill="FBE4D5" w:themeFill="accent2" w:themeFillTint="33"/>
+            <w:hideMark/>
+          </w:tcPr>
+          <w:p>
+            <w:pPr>
+              <w:spacing w:beforeLines="20" w:before="48" w:afterLines="20" w:after="48" w:line="259" w:lineRule="auto"/>
+              <w:rPr>
+                <w:rFonts w:ascii="Times New Roman" w:hAnsi="Times New Roman" w:cs="Times New Roman"/>
+                <w:sz w:val="20"/>
+                <w:szCs w:val="20"/>
+                <w:lang w:val="en-ID"/>
+              </w:rPr>
+            </w:pPr>
+            <w:r>
+              <w:rPr>
+                <w:rFonts w:ascii="Times New Roman" w:hAnsi="Times New Roman" w:cs="Times New Roman"/>
+                <w:sz w:val="20"/>
+                <w:szCs w:val="20"/>
+                <w:lang w:val="en-ID"/>
+              </w:rPr>
+              <w:t>Saldo Koin</w:t>
+            </w:r>
+          </w:p>
+        </w:tc>
+        <w:tc>
+          <w:tcPr>
+            <w:tcW w:w="0" w:type="auto"/>
+            <w:hideMark/>
+          </w:tcPr>
+          <w:p>
+            <w:pPr>
+              <w:spacing w:beforeLines="20" w:before="48" w:afterLines="20" w:after="48" w:line="259" w:lineRule="auto"/>
+              <w:rPr>
+                <w:rFonts w:ascii="Times New Roman" w:hAnsi="Times New Roman" w:cs="Times New Roman"/>
+                <w:sz w:val="20"/>
+                <w:szCs w:val="20"/>
+                <w:lang w:val="en-ID"/>
+              </w:rPr>
+            </w:pPr>
+            <w:r>
+              <w:rPr>
+                <w:rFonts w:ascii="Times New Roman" w:hAnsi="Times New Roman" w:cs="Times New Roman"/>
+                <w:sz w:val="20"/>
+                <w:szCs w:val="20"/>
+                <w:lang w:val="en-ID"/>
+              </w:rPr>
+              <w:t>Sistem menampilkan saldo customer secara real-time</w:t>
             </w:r>
           </w:p>
         </w:tc>
@@ -810,7 +1812,7 @@
                 <w:szCs w:val="20"/>
                 <w:lang w:val="en-ID"/>
               </w:rPr>
-              <w:t>Status sesi bermain</w:t>
+              <w:t>Data saldo customer</w:t>
             </w:r>
           </w:p>
         </w:tc>
@@ -848,52 +1850,53 @@
         <w:tc>
           <w:tcPr>
             <w:tcW w:w="0" w:type="auto"/>
-            <w:hideMark/>
-          </w:tcPr>
-          <w:p>
-            <w:pPr>
-              <w:spacing w:beforeLines="20" w:before="48" w:afterLines="20" w:after="48" w:line="259" w:lineRule="auto"/>
-              <w:rPr>
-                <w:rFonts w:ascii="Times New Roman" w:hAnsi="Times New Roman" w:cs="Times New Roman"/>
-                <w:sz w:val="20"/>
-                <w:szCs w:val="20"/>
-                <w:lang w:val="en-ID"/>
-              </w:rPr>
-            </w:pPr>
-            <w:r>
-              <w:rPr>
-                <w:rFonts w:ascii="Times New Roman" w:hAnsi="Times New Roman" w:cs="Times New Roman"/>
-                <w:sz w:val="20"/>
-                <w:szCs w:val="20"/>
-                <w:lang w:val="en-ID"/>
-              </w:rPr>
-              <w:t>Pesan Tempat Bermain</w:t>
-            </w:r>
-          </w:p>
-        </w:tc>
-        <w:tc>
-          <w:tcPr>
-            <w:tcW w:w="0" w:type="auto"/>
-            <w:hideMark/>
-          </w:tcPr>
-          <w:p>
-            <w:pPr>
-              <w:spacing w:beforeLines="20" w:before="48" w:afterLines="20" w:after="48" w:line="259" w:lineRule="auto"/>
-              <w:rPr>
-                <w:rFonts w:ascii="Times New Roman" w:hAnsi="Times New Roman" w:cs="Times New Roman"/>
-                <w:sz w:val="20"/>
-                <w:szCs w:val="20"/>
-                <w:lang w:val="en-ID"/>
-              </w:rPr>
-            </w:pPr>
-            <w:r>
-              <w:rPr>
-                <w:rFonts w:ascii="Times New Roman" w:hAnsi="Times New Roman" w:cs="Times New Roman"/>
-                <w:sz w:val="20"/>
-                <w:szCs w:val="20"/>
-                <w:lang w:val="en-ID"/>
-              </w:rPr>
-              <w:t>Customer memilih durasi bermain dan sistem memproses pemesanan</w:t>
+            <w:shd w:val="clear" w:color="auto" w:fill="FBE4D5" w:themeFill="accent2" w:themeFillTint="33"/>
+            <w:hideMark/>
+          </w:tcPr>
+          <w:p>
+            <w:pPr>
+              <w:spacing w:beforeLines="20" w:before="48" w:afterLines="20" w:after="48" w:line="259" w:lineRule="auto"/>
+              <w:rPr>
+                <w:rFonts w:ascii="Times New Roman" w:hAnsi="Times New Roman" w:cs="Times New Roman"/>
+                <w:sz w:val="20"/>
+                <w:szCs w:val="20"/>
+                <w:lang w:val="en-ID"/>
+              </w:rPr>
+            </w:pPr>
+            <w:r>
+              <w:rPr>
+                <w:rFonts w:ascii="Times New Roman" w:hAnsi="Times New Roman" w:cs="Times New Roman"/>
+                <w:sz w:val="20"/>
+                <w:szCs w:val="20"/>
+                <w:lang w:val="en-ID"/>
+              </w:rPr>
+              <w:t>Status Bermain</w:t>
+            </w:r>
+          </w:p>
+        </w:tc>
+        <w:tc>
+          <w:tcPr>
+            <w:tcW w:w="0" w:type="auto"/>
+            <w:hideMark/>
+          </w:tcPr>
+          <w:p>
+            <w:pPr>
+              <w:spacing w:beforeLines="20" w:before="48" w:afterLines="20" w:after="48" w:line="259" w:lineRule="auto"/>
+              <w:rPr>
+                <w:rFonts w:ascii="Times New Roman" w:hAnsi="Times New Roman" w:cs="Times New Roman"/>
+                <w:sz w:val="20"/>
+                <w:szCs w:val="20"/>
+                <w:lang w:val="en-ID"/>
+              </w:rPr>
+            </w:pPr>
+            <w:r>
+              <w:rPr>
+                <w:rFonts w:ascii="Times New Roman" w:hAnsi="Times New Roman" w:cs="Times New Roman"/>
+                <w:sz w:val="20"/>
+                <w:szCs w:val="20"/>
+                <w:lang w:val="en-ID"/>
+              </w:rPr>
+              <w:t>Sistem menampilkan status bermain customer</w:t>
             </w:r>
           </w:p>
         </w:tc>
@@ -919,7 +1922,7 @@
                 <w:szCs w:val="20"/>
                 <w:lang w:val="en-ID"/>
               </w:rPr>
-              <w:t>Durasi bermain, Data PC</w:t>
+              <w:t>Status sesi bermain</w:t>
             </w:r>
           </w:p>
         </w:tc>
@@ -957,52 +1960,53 @@
         <w:tc>
           <w:tcPr>
             <w:tcW w:w="0" w:type="auto"/>
-            <w:hideMark/>
-          </w:tcPr>
-          <w:p>
-            <w:pPr>
-              <w:spacing w:beforeLines="20" w:before="48" w:afterLines="20" w:after="48" w:line="259" w:lineRule="auto"/>
-              <w:rPr>
-                <w:rFonts w:ascii="Times New Roman" w:hAnsi="Times New Roman" w:cs="Times New Roman"/>
-                <w:sz w:val="20"/>
-                <w:szCs w:val="20"/>
-                <w:lang w:val="en-ID"/>
-              </w:rPr>
-            </w:pPr>
-            <w:r>
-              <w:rPr>
-                <w:rFonts w:ascii="Times New Roman" w:hAnsi="Times New Roman" w:cs="Times New Roman"/>
-                <w:sz w:val="20"/>
-                <w:szCs w:val="20"/>
-                <w:lang w:val="en-ID"/>
-              </w:rPr>
-              <w:t>Memulai Sesi Bermain</w:t>
-            </w:r>
-          </w:p>
-        </w:tc>
-        <w:tc>
-          <w:tcPr>
-            <w:tcW w:w="0" w:type="auto"/>
-            <w:hideMark/>
-          </w:tcPr>
-          <w:p>
-            <w:pPr>
-              <w:spacing w:beforeLines="20" w:before="48" w:afterLines="20" w:after="48" w:line="259" w:lineRule="auto"/>
-              <w:rPr>
-                <w:rFonts w:ascii="Times New Roman" w:hAnsi="Times New Roman" w:cs="Times New Roman"/>
-                <w:sz w:val="20"/>
-                <w:szCs w:val="20"/>
-                <w:lang w:val="en-ID"/>
-              </w:rPr>
-            </w:pPr>
-            <w:r>
-              <w:rPr>
-                <w:rFonts w:ascii="Times New Roman" w:hAnsi="Times New Roman" w:cs="Times New Roman"/>
-                <w:sz w:val="20"/>
-                <w:szCs w:val="20"/>
-                <w:lang w:val="en-ID"/>
-              </w:rPr>
-              <w:t>Sistem membuat dan memulai sesi bermain customer</w:t>
+            <w:shd w:val="clear" w:color="auto" w:fill="E2EFD9" w:themeFill="accent6" w:themeFillTint="33"/>
+            <w:hideMark/>
+          </w:tcPr>
+          <w:p>
+            <w:pPr>
+              <w:spacing w:beforeLines="20" w:before="48" w:afterLines="20" w:after="48" w:line="259" w:lineRule="auto"/>
+              <w:rPr>
+                <w:rFonts w:ascii="Times New Roman" w:hAnsi="Times New Roman" w:cs="Times New Roman"/>
+                <w:sz w:val="20"/>
+                <w:szCs w:val="20"/>
+                <w:lang w:val="en-ID"/>
+              </w:rPr>
+            </w:pPr>
+            <w:r>
+              <w:rPr>
+                <w:rFonts w:ascii="Times New Roman" w:hAnsi="Times New Roman" w:cs="Times New Roman"/>
+                <w:sz w:val="20"/>
+                <w:szCs w:val="20"/>
+                <w:lang w:val="en-ID"/>
+              </w:rPr>
+              <w:t>Pesan Tempat Bermain</w:t>
+            </w:r>
+          </w:p>
+        </w:tc>
+        <w:tc>
+          <w:tcPr>
+            <w:tcW w:w="0" w:type="auto"/>
+            <w:hideMark/>
+          </w:tcPr>
+          <w:p>
+            <w:pPr>
+              <w:spacing w:beforeLines="20" w:before="48" w:afterLines="20" w:after="48" w:line="259" w:lineRule="auto"/>
+              <w:rPr>
+                <w:rFonts w:ascii="Times New Roman" w:hAnsi="Times New Roman" w:cs="Times New Roman"/>
+                <w:sz w:val="20"/>
+                <w:szCs w:val="20"/>
+                <w:lang w:val="en-ID"/>
+              </w:rPr>
+            </w:pPr>
+            <w:r>
+              <w:rPr>
+                <w:rFonts w:ascii="Times New Roman" w:hAnsi="Times New Roman" w:cs="Times New Roman"/>
+                <w:sz w:val="20"/>
+                <w:szCs w:val="20"/>
+                <w:lang w:val="en-ID"/>
+              </w:rPr>
+              <w:t>Customer memilih durasi bermain dan sistem memproses pemesanan</w:t>
             </w:r>
           </w:p>
         </w:tc>
@@ -1028,7 +2032,7 @@
                 <w:szCs w:val="20"/>
                 <w:lang w:val="en-ID"/>
               </w:rPr>
-              <w:t>Data sesi bermain</w:t>
+              <w:t>Durasi bermain, Data PC</w:t>
             </w:r>
           </w:p>
         </w:tc>
@@ -1066,52 +2070,53 @@
         <w:tc>
           <w:tcPr>
             <w:tcW w:w="0" w:type="auto"/>
-            <w:hideMark/>
-          </w:tcPr>
-          <w:p>
-            <w:pPr>
-              <w:spacing w:beforeLines="20" w:before="48" w:afterLines="20" w:after="48" w:line="259" w:lineRule="auto"/>
-              <w:rPr>
-                <w:rFonts w:ascii="Times New Roman" w:hAnsi="Times New Roman" w:cs="Times New Roman"/>
-                <w:sz w:val="20"/>
-                <w:szCs w:val="20"/>
-                <w:lang w:val="en-ID"/>
-              </w:rPr>
-            </w:pPr>
-            <w:r>
-              <w:rPr>
-                <w:rFonts w:ascii="Times New Roman" w:hAnsi="Times New Roman" w:cs="Times New Roman"/>
-                <w:sz w:val="20"/>
-                <w:szCs w:val="20"/>
-                <w:lang w:val="en-ID"/>
-              </w:rPr>
-              <w:t>Countdown Waktu Bermain</w:t>
-            </w:r>
-          </w:p>
-        </w:tc>
-        <w:tc>
-          <w:tcPr>
-            <w:tcW w:w="0" w:type="auto"/>
-            <w:hideMark/>
-          </w:tcPr>
-          <w:p>
-            <w:pPr>
-              <w:spacing w:beforeLines="20" w:before="48" w:afterLines="20" w:after="48" w:line="259" w:lineRule="auto"/>
-              <w:rPr>
-                <w:rFonts w:ascii="Times New Roman" w:hAnsi="Times New Roman" w:cs="Times New Roman"/>
-                <w:sz w:val="20"/>
-                <w:szCs w:val="20"/>
-                <w:lang w:val="en-ID"/>
-              </w:rPr>
-            </w:pPr>
-            <w:r>
-              <w:rPr>
-                <w:rFonts w:ascii="Times New Roman" w:hAnsi="Times New Roman" w:cs="Times New Roman"/>
-                <w:sz w:val="20"/>
-                <w:szCs w:val="20"/>
-                <w:lang w:val="en-ID"/>
-              </w:rPr>
-              <w:t>Sistem menampilkan countdown waktu bermain selama sesi aktif</w:t>
+            <w:shd w:val="clear" w:color="auto" w:fill="E2EFD9" w:themeFill="accent6" w:themeFillTint="33"/>
+            <w:hideMark/>
+          </w:tcPr>
+          <w:p>
+            <w:pPr>
+              <w:spacing w:beforeLines="20" w:before="48" w:afterLines="20" w:after="48" w:line="259" w:lineRule="auto"/>
+              <w:rPr>
+                <w:rFonts w:ascii="Times New Roman" w:hAnsi="Times New Roman" w:cs="Times New Roman"/>
+                <w:sz w:val="20"/>
+                <w:szCs w:val="20"/>
+                <w:lang w:val="en-ID"/>
+              </w:rPr>
+            </w:pPr>
+            <w:r>
+              <w:rPr>
+                <w:rFonts w:ascii="Times New Roman" w:hAnsi="Times New Roman" w:cs="Times New Roman"/>
+                <w:sz w:val="20"/>
+                <w:szCs w:val="20"/>
+                <w:lang w:val="en-ID"/>
+              </w:rPr>
+              <w:t>Memulai Sesi Bermain</w:t>
+            </w:r>
+          </w:p>
+        </w:tc>
+        <w:tc>
+          <w:tcPr>
+            <w:tcW w:w="0" w:type="auto"/>
+            <w:hideMark/>
+          </w:tcPr>
+          <w:p>
+            <w:pPr>
+              <w:spacing w:beforeLines="20" w:before="48" w:afterLines="20" w:after="48" w:line="259" w:lineRule="auto"/>
+              <w:rPr>
+                <w:rFonts w:ascii="Times New Roman" w:hAnsi="Times New Roman" w:cs="Times New Roman"/>
+                <w:sz w:val="20"/>
+                <w:szCs w:val="20"/>
+                <w:lang w:val="en-ID"/>
+              </w:rPr>
+            </w:pPr>
+            <w:r>
+              <w:rPr>
+                <w:rFonts w:ascii="Times New Roman" w:hAnsi="Times New Roman" w:cs="Times New Roman"/>
+                <w:sz w:val="20"/>
+                <w:szCs w:val="20"/>
+                <w:lang w:val="en-ID"/>
+              </w:rPr>
+              <w:t>Sistem membuat dan memulai sesi bermain customer</w:t>
             </w:r>
           </w:p>
         </w:tc>
@@ -1137,7 +2142,7 @@
                 <w:szCs w:val="20"/>
                 <w:lang w:val="en-ID"/>
               </w:rPr>
-              <w:t>Waktu sesi bermain</w:t>
+              <w:t>Data sesi bermain</w:t>
             </w:r>
           </w:p>
         </w:tc>
@@ -1175,52 +2180,53 @@
         <w:tc>
           <w:tcPr>
             <w:tcW w:w="0" w:type="auto"/>
-            <w:hideMark/>
-          </w:tcPr>
-          <w:p>
-            <w:pPr>
-              <w:spacing w:beforeLines="20" w:before="48" w:afterLines="20" w:after="48" w:line="259" w:lineRule="auto"/>
-              <w:rPr>
-                <w:rFonts w:ascii="Times New Roman" w:hAnsi="Times New Roman" w:cs="Times New Roman"/>
-                <w:sz w:val="20"/>
-                <w:szCs w:val="20"/>
-                <w:lang w:val="en-ID"/>
-              </w:rPr>
-            </w:pPr>
-            <w:r>
-              <w:rPr>
-                <w:rFonts w:ascii="Times New Roman" w:hAnsi="Times New Roman" w:cs="Times New Roman"/>
-                <w:sz w:val="20"/>
-                <w:szCs w:val="20"/>
-                <w:lang w:val="en-ID"/>
-              </w:rPr>
-              <w:t>Pengurangan Saldo Bermain</w:t>
-            </w:r>
-          </w:p>
-        </w:tc>
-        <w:tc>
-          <w:tcPr>
-            <w:tcW w:w="0" w:type="auto"/>
-            <w:hideMark/>
-          </w:tcPr>
-          <w:p>
-            <w:pPr>
-              <w:spacing w:beforeLines="20" w:before="48" w:afterLines="20" w:after="48" w:line="259" w:lineRule="auto"/>
-              <w:rPr>
-                <w:rFonts w:ascii="Times New Roman" w:hAnsi="Times New Roman" w:cs="Times New Roman"/>
-                <w:sz w:val="20"/>
-                <w:szCs w:val="20"/>
-                <w:lang w:val="en-ID"/>
-              </w:rPr>
-            </w:pPr>
-            <w:r>
-              <w:rPr>
-                <w:rFonts w:ascii="Times New Roman" w:hAnsi="Times New Roman" w:cs="Times New Roman"/>
-                <w:sz w:val="20"/>
-                <w:szCs w:val="20"/>
-                <w:lang w:val="en-ID"/>
-              </w:rPr>
-              <w:t>Sistem mengurangi saldo setelah sesi bermain dimulai</w:t>
+            <w:shd w:val="clear" w:color="auto" w:fill="E2EFD9" w:themeFill="accent6" w:themeFillTint="33"/>
+            <w:hideMark/>
+          </w:tcPr>
+          <w:p>
+            <w:pPr>
+              <w:spacing w:beforeLines="20" w:before="48" w:afterLines="20" w:after="48" w:line="259" w:lineRule="auto"/>
+              <w:rPr>
+                <w:rFonts w:ascii="Times New Roman" w:hAnsi="Times New Roman" w:cs="Times New Roman"/>
+                <w:sz w:val="20"/>
+                <w:szCs w:val="20"/>
+                <w:lang w:val="en-ID"/>
+              </w:rPr>
+            </w:pPr>
+            <w:r>
+              <w:rPr>
+                <w:rFonts w:ascii="Times New Roman" w:hAnsi="Times New Roman" w:cs="Times New Roman"/>
+                <w:sz w:val="20"/>
+                <w:szCs w:val="20"/>
+                <w:lang w:val="en-ID"/>
+              </w:rPr>
+              <w:t>Countdown Waktu Bermain</w:t>
+            </w:r>
+          </w:p>
+        </w:tc>
+        <w:tc>
+          <w:tcPr>
+            <w:tcW w:w="0" w:type="auto"/>
+            <w:hideMark/>
+          </w:tcPr>
+          <w:p>
+            <w:pPr>
+              <w:spacing w:beforeLines="20" w:before="48" w:afterLines="20" w:after="48" w:line="259" w:lineRule="auto"/>
+              <w:rPr>
+                <w:rFonts w:ascii="Times New Roman" w:hAnsi="Times New Roman" w:cs="Times New Roman"/>
+                <w:sz w:val="20"/>
+                <w:szCs w:val="20"/>
+                <w:lang w:val="en-ID"/>
+              </w:rPr>
+            </w:pPr>
+            <w:r>
+              <w:rPr>
+                <w:rFonts w:ascii="Times New Roman" w:hAnsi="Times New Roman" w:cs="Times New Roman"/>
+                <w:sz w:val="20"/>
+                <w:szCs w:val="20"/>
+                <w:lang w:val="en-ID"/>
+              </w:rPr>
+              <w:t>Sistem menampilkan countdown waktu bermain selama sesi aktif</w:t>
             </w:r>
           </w:p>
         </w:tc>
@@ -1246,7 +2252,7 @@
                 <w:szCs w:val="20"/>
                 <w:lang w:val="en-ID"/>
               </w:rPr>
-              <w:t>Saldo customer, Harga sesi</w:t>
+              <w:t>Waktu sesi bermain</w:t>
             </w:r>
           </w:p>
         </w:tc>
@@ -1284,52 +2290,53 @@
         <w:tc>
           <w:tcPr>
             <w:tcW w:w="0" w:type="auto"/>
-            <w:hideMark/>
-          </w:tcPr>
-          <w:p>
-            <w:pPr>
-              <w:spacing w:beforeLines="20" w:before="48" w:afterLines="20" w:after="48" w:line="259" w:lineRule="auto"/>
-              <w:rPr>
-                <w:rFonts w:ascii="Times New Roman" w:hAnsi="Times New Roman" w:cs="Times New Roman"/>
-                <w:sz w:val="20"/>
-                <w:szCs w:val="20"/>
-                <w:lang w:val="en-ID"/>
-              </w:rPr>
-            </w:pPr>
-            <w:r>
-              <w:rPr>
-                <w:rFonts w:ascii="Times New Roman" w:hAnsi="Times New Roman" w:cs="Times New Roman"/>
-                <w:sz w:val="20"/>
-                <w:szCs w:val="20"/>
-                <w:lang w:val="en-ID"/>
-              </w:rPr>
-              <w:t>Menu Makanan &amp; Minuman</w:t>
-            </w:r>
-          </w:p>
-        </w:tc>
-        <w:tc>
-          <w:tcPr>
-            <w:tcW w:w="0" w:type="auto"/>
-            <w:hideMark/>
-          </w:tcPr>
-          <w:p>
-            <w:pPr>
-              <w:spacing w:beforeLines="20" w:before="48" w:afterLines="20" w:after="48" w:line="259" w:lineRule="auto"/>
-              <w:rPr>
-                <w:rFonts w:ascii="Times New Roman" w:hAnsi="Times New Roman" w:cs="Times New Roman"/>
-                <w:sz w:val="20"/>
-                <w:szCs w:val="20"/>
-                <w:lang w:val="en-ID"/>
-              </w:rPr>
-            </w:pPr>
-            <w:r>
-              <w:rPr>
-                <w:rFonts w:ascii="Times New Roman" w:hAnsi="Times New Roman" w:cs="Times New Roman"/>
-                <w:sz w:val="20"/>
-                <w:szCs w:val="20"/>
-                <w:lang w:val="en-ID"/>
-              </w:rPr>
-              <w:t>Sistem menampilkan daftar menu makanan dan minuman</w:t>
+            <w:shd w:val="clear" w:color="auto" w:fill="E2EFD9" w:themeFill="accent6" w:themeFillTint="33"/>
+            <w:hideMark/>
+          </w:tcPr>
+          <w:p>
+            <w:pPr>
+              <w:spacing w:beforeLines="20" w:before="48" w:afterLines="20" w:after="48" w:line="259" w:lineRule="auto"/>
+              <w:rPr>
+                <w:rFonts w:ascii="Times New Roman" w:hAnsi="Times New Roman" w:cs="Times New Roman"/>
+                <w:sz w:val="20"/>
+                <w:szCs w:val="20"/>
+                <w:lang w:val="en-ID"/>
+              </w:rPr>
+            </w:pPr>
+            <w:r>
+              <w:rPr>
+                <w:rFonts w:ascii="Times New Roman" w:hAnsi="Times New Roman" w:cs="Times New Roman"/>
+                <w:sz w:val="20"/>
+                <w:szCs w:val="20"/>
+                <w:lang w:val="en-ID"/>
+              </w:rPr>
+              <w:t>Pengurangan Saldo Bermain</w:t>
+            </w:r>
+          </w:p>
+        </w:tc>
+        <w:tc>
+          <w:tcPr>
+            <w:tcW w:w="0" w:type="auto"/>
+            <w:hideMark/>
+          </w:tcPr>
+          <w:p>
+            <w:pPr>
+              <w:spacing w:beforeLines="20" w:before="48" w:afterLines="20" w:after="48" w:line="259" w:lineRule="auto"/>
+              <w:rPr>
+                <w:rFonts w:ascii="Times New Roman" w:hAnsi="Times New Roman" w:cs="Times New Roman"/>
+                <w:sz w:val="20"/>
+                <w:szCs w:val="20"/>
+                <w:lang w:val="en-ID"/>
+              </w:rPr>
+            </w:pPr>
+            <w:r>
+              <w:rPr>
+                <w:rFonts w:ascii="Times New Roman" w:hAnsi="Times New Roman" w:cs="Times New Roman"/>
+                <w:sz w:val="20"/>
+                <w:szCs w:val="20"/>
+                <w:lang w:val="en-ID"/>
+              </w:rPr>
+              <w:t>Sistem mengurangi saldo setelah sesi bermain dimulai</w:t>
             </w:r>
           </w:p>
         </w:tc>
@@ -1355,7 +2362,7 @@
                 <w:szCs w:val="20"/>
                 <w:lang w:val="en-ID"/>
               </w:rPr>
-              <w:t>Data menu makanan/minuman</w:t>
+              <w:t>Saldo customer, Harga sesi</w:t>
             </w:r>
           </w:p>
         </w:tc>
@@ -1393,92 +2400,91 @@
         <w:tc>
           <w:tcPr>
             <w:tcW w:w="0" w:type="auto"/>
-            <w:hideMark/>
-          </w:tcPr>
-          <w:p>
-            <w:pPr>
-              <w:spacing w:beforeLines="20" w:before="48" w:afterLines="20" w:after="48" w:line="259" w:lineRule="auto"/>
-              <w:rPr>
-                <w:rFonts w:ascii="Times New Roman" w:hAnsi="Times New Roman" w:cs="Times New Roman"/>
-                <w:sz w:val="20"/>
-                <w:szCs w:val="20"/>
-                <w:lang w:val="en-ID"/>
-              </w:rPr>
-            </w:pPr>
-            <w:r>
-              <w:rPr>
-                <w:rFonts w:ascii="Times New Roman" w:hAnsi="Times New Roman" w:cs="Times New Roman"/>
-                <w:sz w:val="20"/>
-                <w:szCs w:val="20"/>
-                <w:lang w:val="en-ID"/>
-              </w:rPr>
-              <w:t>Pemrosesan Pesanan Makanan</w:t>
-            </w:r>
-          </w:p>
-        </w:tc>
-        <w:tc>
-          <w:tcPr>
-            <w:tcW w:w="0" w:type="auto"/>
-            <w:hideMark/>
-          </w:tcPr>
-          <w:p>
-            <w:pPr>
-              <w:spacing w:beforeLines="20" w:before="48" w:afterLines="20" w:after="48" w:line="259" w:lineRule="auto"/>
-              <w:rPr>
-                <w:rFonts w:ascii="Times New Roman" w:hAnsi="Times New Roman" w:cs="Times New Roman"/>
-                <w:sz w:val="20"/>
-                <w:szCs w:val="20"/>
-                <w:lang w:val="en-ID"/>
-              </w:rPr>
-            </w:pPr>
-            <w:r>
-              <w:rPr>
-                <w:rFonts w:ascii="Times New Roman" w:hAnsi="Times New Roman" w:cs="Times New Roman"/>
-                <w:sz w:val="20"/>
-                <w:szCs w:val="20"/>
-                <w:lang w:val="en-ID"/>
-              </w:rPr>
-              <w:t>Customer memilih menu dan sistem memproses pesanan</w:t>
+            <w:shd w:val="clear" w:color="auto" w:fill="E2EFD9" w:themeFill="accent6" w:themeFillTint="33"/>
+          </w:tcPr>
+          <w:p>
+            <w:pPr>
+              <w:spacing w:beforeLines="20" w:before="48" w:afterLines="20" w:after="48"/>
+              <w:rPr>
+                <w:rFonts w:ascii="Times New Roman" w:hAnsi="Times New Roman" w:cs="Times New Roman"/>
+                <w:sz w:val="20"/>
+                <w:szCs w:val="20"/>
+                <w:lang w:val="en-ID"/>
+              </w:rPr>
+            </w:pPr>
+            <w:r>
+              <w:rPr>
+                <w:rFonts w:ascii="Times New Roman" w:hAnsi="Times New Roman" w:cs="Times New Roman"/>
+                <w:sz w:val="20"/>
+                <w:szCs w:val="20"/>
+                <w:lang w:val="en-ID"/>
+              </w:rPr>
+              <w:t>Countdown Berakhir</w:t>
+            </w:r>
+          </w:p>
+        </w:tc>
+        <w:tc>
+          <w:tcPr>
+            <w:tcW w:w="0" w:type="auto"/>
+          </w:tcPr>
+          <w:p>
+            <w:pPr>
+              <w:spacing w:beforeLines="20" w:before="48" w:afterLines="20" w:after="48"/>
+              <w:rPr>
+                <w:rFonts w:ascii="Times New Roman" w:hAnsi="Times New Roman" w:cs="Times New Roman"/>
+                <w:sz w:val="20"/>
+                <w:szCs w:val="20"/>
+                <w:lang w:val="en-ID"/>
+              </w:rPr>
+            </w:pPr>
+            <w:r>
+              <w:rPr>
+                <w:rFonts w:ascii="Times New Roman" w:hAnsi="Times New Roman" w:cs="Times New Roman"/>
+                <w:sz w:val="20"/>
+                <w:szCs w:val="20"/>
+                <w:lang w:val="en-ID"/>
+              </w:rPr>
+              <w:t>Sistem otomatis mengakhiri sesi saat waktu habis</w:t>
             </w:r>
           </w:p>
         </w:tc>
         <w:tc>
           <w:tcPr>
             <w:tcW w:w="2233" w:type="dxa"/>
-            <w:hideMark/>
-          </w:tcPr>
-          <w:p>
-            <w:pPr>
-              <w:spacing w:beforeLines="20" w:before="48" w:afterLines="20" w:after="48" w:line="259" w:lineRule="auto"/>
-              <w:rPr>
-                <w:rFonts w:ascii="Times New Roman" w:hAnsi="Times New Roman" w:cs="Times New Roman"/>
-                <w:sz w:val="20"/>
-                <w:szCs w:val="20"/>
-                <w:lang w:val="en-ID"/>
-              </w:rPr>
-            </w:pPr>
-            <w:r>
-              <w:rPr>
-                <w:rFonts w:ascii="Times New Roman" w:hAnsi="Times New Roman" w:cs="Times New Roman"/>
-                <w:sz w:val="20"/>
-                <w:szCs w:val="20"/>
-                <w:lang w:val="en-ID"/>
-              </w:rPr>
-              <w:t>Nama menu, Jumlah pesanan</w:t>
+          </w:tcPr>
+          <w:p>
+            <w:pPr>
+              <w:spacing w:beforeLines="20" w:before="48" w:afterLines="20" w:after="48"/>
+              <w:rPr>
+                <w:rFonts w:ascii="Times New Roman" w:hAnsi="Times New Roman" w:cs="Times New Roman"/>
+                <w:sz w:val="20"/>
+                <w:szCs w:val="20"/>
+                <w:lang w:val="en-ID"/>
+              </w:rPr>
+            </w:pPr>
+            <w:r>
+              <w:rPr>
+                <w:rFonts w:ascii="Times New Roman" w:hAnsi="Times New Roman" w:cs="Times New Roman"/>
+                <w:sz w:val="20"/>
+                <w:szCs w:val="20"/>
+                <w:lang w:val="en-ID"/>
+              </w:rPr>
+              <w:t>Waktu sesi habis</w:t>
             </w:r>
           </w:p>
         </w:tc>
         <w:tc>
           <w:tcPr>
             <w:tcW w:w="1224" w:type="dxa"/>
-            <w:hideMark/>
-          </w:tcPr>
-          <w:p>
-            <w:pPr>
-              <w:spacing w:beforeLines="20" w:before="48" w:afterLines="20" w:after="48" w:line="259" w:lineRule="auto"/>
+          </w:tcPr>
+          <w:p>
+            <w:pPr>
+              <w:spacing w:beforeLines="20" w:before="48" w:afterLines="20" w:after="48"/>
               <w:jc w:val="center"/>
               <w:rPr>
                 <w:rFonts w:ascii="Times New Roman" w:hAnsi="Times New Roman" w:cs="Times New Roman"/>
+                <w:b/>
+                <w:bCs/>
                 <w:sz w:val="20"/>
                 <w:szCs w:val="20"/>
                 <w:lang w:val="en-ID"/>
@@ -1502,52 +2508,54 @@
         <w:tc>
           <w:tcPr>
             <w:tcW w:w="0" w:type="auto"/>
-            <w:hideMark/>
-          </w:tcPr>
-          <w:p>
-            <w:pPr>
-              <w:spacing w:beforeLines="20" w:before="48" w:afterLines="20" w:after="48" w:line="259" w:lineRule="auto"/>
-              <w:rPr>
-                <w:rFonts w:ascii="Times New Roman" w:hAnsi="Times New Roman" w:cs="Times New Roman"/>
-                <w:sz w:val="20"/>
-                <w:szCs w:val="20"/>
-                <w:lang w:val="en-ID"/>
-              </w:rPr>
-            </w:pPr>
-            <w:r>
-              <w:rPr>
-                <w:rFonts w:ascii="Times New Roman" w:hAnsi="Times New Roman" w:cs="Times New Roman"/>
-                <w:sz w:val="20"/>
-                <w:szCs w:val="20"/>
-                <w:lang w:val="en-ID"/>
-              </w:rPr>
-              <w:t>Pengurangan Saldo Pembelian</w:t>
-            </w:r>
-          </w:p>
-        </w:tc>
-        <w:tc>
-          <w:tcPr>
-            <w:tcW w:w="0" w:type="auto"/>
-            <w:hideMark/>
-          </w:tcPr>
-          <w:p>
-            <w:pPr>
-              <w:spacing w:beforeLines="20" w:before="48" w:afterLines="20" w:after="48" w:line="259" w:lineRule="auto"/>
-              <w:rPr>
-                <w:rFonts w:ascii="Times New Roman" w:hAnsi="Times New Roman" w:cs="Times New Roman"/>
-                <w:sz w:val="20"/>
-                <w:szCs w:val="20"/>
-                <w:lang w:val="en-ID"/>
-              </w:rPr>
-            </w:pPr>
-            <w:r>
-              <w:rPr>
-                <w:rFonts w:ascii="Times New Roman" w:hAnsi="Times New Roman" w:cs="Times New Roman"/>
-                <w:sz w:val="20"/>
-                <w:szCs w:val="20"/>
-                <w:lang w:val="en-ID"/>
-              </w:rPr>
-              <w:t>Sistem mengurangi saldo setelah pembelian makanan/minuman</w:t>
+            <w:shd w:val="clear" w:color="auto" w:fill="FFFF00"/>
+            <w:hideMark/>
+          </w:tcPr>
+          <w:p>
+            <w:pPr>
+              <w:spacing w:beforeLines="20" w:before="48" w:afterLines="20" w:after="48" w:line="259" w:lineRule="auto"/>
+              <w:rPr>
+                <w:rFonts w:ascii="Times New Roman" w:hAnsi="Times New Roman" w:cs="Times New Roman"/>
+                <w:sz w:val="20"/>
+                <w:szCs w:val="20"/>
+                <w:lang w:val="en-ID"/>
+              </w:rPr>
+            </w:pPr>
+            <w:r>
+              <w:rPr>
+                <w:rFonts w:ascii="Times New Roman" w:hAnsi="Times New Roman" w:cs="Times New Roman"/>
+                <w:sz w:val="20"/>
+                <w:szCs w:val="20"/>
+                <w:lang w:val="en-ID"/>
+              </w:rPr>
+              <w:lastRenderedPageBreak/>
+              <w:t>Menu Makanan &amp; Minuman</w:t>
+            </w:r>
+          </w:p>
+        </w:tc>
+        <w:tc>
+          <w:tcPr>
+            <w:tcW w:w="0" w:type="auto"/>
+            <w:hideMark/>
+          </w:tcPr>
+          <w:p>
+            <w:pPr>
+              <w:spacing w:beforeLines="20" w:before="48" w:afterLines="20" w:after="48" w:line="259" w:lineRule="auto"/>
+              <w:rPr>
+                <w:rFonts w:ascii="Times New Roman" w:hAnsi="Times New Roman" w:cs="Times New Roman"/>
+                <w:sz w:val="20"/>
+                <w:szCs w:val="20"/>
+                <w:lang w:val="en-ID"/>
+              </w:rPr>
+            </w:pPr>
+            <w:r>
+              <w:rPr>
+                <w:rFonts w:ascii="Times New Roman" w:hAnsi="Times New Roman" w:cs="Times New Roman"/>
+                <w:sz w:val="20"/>
+                <w:szCs w:val="20"/>
+                <w:lang w:val="en-ID"/>
+              </w:rPr>
+              <w:t>Sistem menampilkan daftar menu makanan dan minuman</w:t>
             </w:r>
           </w:p>
         </w:tc>
@@ -1573,7 +2581,7 @@
                 <w:szCs w:val="20"/>
                 <w:lang w:val="en-ID"/>
               </w:rPr>
-              <w:t>Saldo customer, Total harga</w:t>
+              <w:t>Data menu makanan/minuman</w:t>
             </w:r>
           </w:p>
         </w:tc>
@@ -1611,52 +2619,53 @@
         <w:tc>
           <w:tcPr>
             <w:tcW w:w="0" w:type="auto"/>
-            <w:hideMark/>
-          </w:tcPr>
-          <w:p>
-            <w:pPr>
-              <w:spacing w:beforeLines="20" w:before="48" w:afterLines="20" w:after="48" w:line="259" w:lineRule="auto"/>
-              <w:rPr>
-                <w:rFonts w:ascii="Times New Roman" w:hAnsi="Times New Roman" w:cs="Times New Roman"/>
-                <w:sz w:val="20"/>
-                <w:szCs w:val="20"/>
-                <w:lang w:val="en-ID"/>
-              </w:rPr>
-            </w:pPr>
-            <w:r>
-              <w:rPr>
-                <w:rFonts w:ascii="Times New Roman" w:hAnsi="Times New Roman" w:cs="Times New Roman"/>
-                <w:sz w:val="20"/>
-                <w:szCs w:val="20"/>
-                <w:lang w:val="en-ID"/>
-              </w:rPr>
-              <w:t>Top Up Saldo</w:t>
-            </w:r>
-          </w:p>
-        </w:tc>
-        <w:tc>
-          <w:tcPr>
-            <w:tcW w:w="0" w:type="auto"/>
-            <w:hideMark/>
-          </w:tcPr>
-          <w:p>
-            <w:pPr>
-              <w:spacing w:beforeLines="20" w:before="48" w:afterLines="20" w:after="48" w:line="259" w:lineRule="auto"/>
-              <w:rPr>
-                <w:rFonts w:ascii="Times New Roman" w:hAnsi="Times New Roman" w:cs="Times New Roman"/>
-                <w:sz w:val="20"/>
-                <w:szCs w:val="20"/>
-                <w:lang w:val="en-ID"/>
-              </w:rPr>
-            </w:pPr>
-            <w:r>
-              <w:rPr>
-                <w:rFonts w:ascii="Times New Roman" w:hAnsi="Times New Roman" w:cs="Times New Roman"/>
-                <w:sz w:val="20"/>
-                <w:szCs w:val="20"/>
-                <w:lang w:val="en-ID"/>
-              </w:rPr>
-              <w:t>Customer memilih nominal top up</w:t>
+            <w:shd w:val="clear" w:color="auto" w:fill="FFFF00"/>
+            <w:hideMark/>
+          </w:tcPr>
+          <w:p>
+            <w:pPr>
+              <w:spacing w:beforeLines="20" w:before="48" w:afterLines="20" w:after="48" w:line="259" w:lineRule="auto"/>
+              <w:rPr>
+                <w:rFonts w:ascii="Times New Roman" w:hAnsi="Times New Roman" w:cs="Times New Roman"/>
+                <w:sz w:val="20"/>
+                <w:szCs w:val="20"/>
+                <w:lang w:val="en-ID"/>
+              </w:rPr>
+            </w:pPr>
+            <w:r>
+              <w:rPr>
+                <w:rFonts w:ascii="Times New Roman" w:hAnsi="Times New Roman" w:cs="Times New Roman"/>
+                <w:sz w:val="20"/>
+                <w:szCs w:val="20"/>
+                <w:lang w:val="en-ID"/>
+              </w:rPr>
+              <w:t>Pemrosesan Pesanan Makanan</w:t>
+            </w:r>
+          </w:p>
+        </w:tc>
+        <w:tc>
+          <w:tcPr>
+            <w:tcW w:w="0" w:type="auto"/>
+            <w:hideMark/>
+          </w:tcPr>
+          <w:p>
+            <w:pPr>
+              <w:spacing w:beforeLines="20" w:before="48" w:afterLines="20" w:after="48" w:line="259" w:lineRule="auto"/>
+              <w:rPr>
+                <w:rFonts w:ascii="Times New Roman" w:hAnsi="Times New Roman" w:cs="Times New Roman"/>
+                <w:sz w:val="20"/>
+                <w:szCs w:val="20"/>
+                <w:lang w:val="en-ID"/>
+              </w:rPr>
+            </w:pPr>
+            <w:r>
+              <w:rPr>
+                <w:rFonts w:ascii="Times New Roman" w:hAnsi="Times New Roman" w:cs="Times New Roman"/>
+                <w:sz w:val="20"/>
+                <w:szCs w:val="20"/>
+                <w:lang w:val="en-ID"/>
+              </w:rPr>
+              <w:t>Customer memilih menu dan sistem memproses pesanan</w:t>
             </w:r>
           </w:p>
         </w:tc>
@@ -1682,7 +2691,7 @@
                 <w:szCs w:val="20"/>
                 <w:lang w:val="en-ID"/>
               </w:rPr>
-              <w:t>Nominal top up</w:t>
+              <w:t>Nama menu, Jumlah pesanan</w:t>
             </w:r>
           </w:p>
         </w:tc>
@@ -1720,52 +2729,53 @@
         <w:tc>
           <w:tcPr>
             <w:tcW w:w="0" w:type="auto"/>
-            <w:hideMark/>
-          </w:tcPr>
-          <w:p>
-            <w:pPr>
-              <w:spacing w:beforeLines="20" w:before="48" w:afterLines="20" w:after="48" w:line="259" w:lineRule="auto"/>
-              <w:rPr>
-                <w:rFonts w:ascii="Times New Roman" w:hAnsi="Times New Roman" w:cs="Times New Roman"/>
-                <w:sz w:val="20"/>
-                <w:szCs w:val="20"/>
-                <w:lang w:val="en-ID"/>
-              </w:rPr>
-            </w:pPr>
-            <w:r>
-              <w:rPr>
-                <w:rFonts w:ascii="Times New Roman" w:hAnsi="Times New Roman" w:cs="Times New Roman"/>
-                <w:sz w:val="20"/>
-                <w:szCs w:val="20"/>
-                <w:lang w:val="en-ID"/>
-              </w:rPr>
-              <w:t>Payment Gateway</w:t>
-            </w:r>
-          </w:p>
-        </w:tc>
-        <w:tc>
-          <w:tcPr>
-            <w:tcW w:w="0" w:type="auto"/>
-            <w:hideMark/>
-          </w:tcPr>
-          <w:p>
-            <w:pPr>
-              <w:spacing w:beforeLines="20" w:before="48" w:afterLines="20" w:after="48" w:line="259" w:lineRule="auto"/>
-              <w:rPr>
-                <w:rFonts w:ascii="Times New Roman" w:hAnsi="Times New Roman" w:cs="Times New Roman"/>
-                <w:sz w:val="20"/>
-                <w:szCs w:val="20"/>
-                <w:lang w:val="en-ID"/>
-              </w:rPr>
-            </w:pPr>
-            <w:r>
-              <w:rPr>
-                <w:rFonts w:ascii="Times New Roman" w:hAnsi="Times New Roman" w:cs="Times New Roman"/>
-                <w:sz w:val="20"/>
-                <w:szCs w:val="20"/>
-                <w:lang w:val="en-ID"/>
-              </w:rPr>
-              <w:t>Sistem memproses pembayaran melalui payment gateway</w:t>
+            <w:shd w:val="clear" w:color="auto" w:fill="FFFF00"/>
+            <w:hideMark/>
+          </w:tcPr>
+          <w:p>
+            <w:pPr>
+              <w:spacing w:beforeLines="20" w:before="48" w:afterLines="20" w:after="48" w:line="259" w:lineRule="auto"/>
+              <w:rPr>
+                <w:rFonts w:ascii="Times New Roman" w:hAnsi="Times New Roman" w:cs="Times New Roman"/>
+                <w:sz w:val="20"/>
+                <w:szCs w:val="20"/>
+                <w:lang w:val="en-ID"/>
+              </w:rPr>
+            </w:pPr>
+            <w:r>
+              <w:rPr>
+                <w:rFonts w:ascii="Times New Roman" w:hAnsi="Times New Roman" w:cs="Times New Roman"/>
+                <w:sz w:val="20"/>
+                <w:szCs w:val="20"/>
+                <w:lang w:val="en-ID"/>
+              </w:rPr>
+              <w:t>Pengurangan Saldo Pembelian</w:t>
+            </w:r>
+          </w:p>
+        </w:tc>
+        <w:tc>
+          <w:tcPr>
+            <w:tcW w:w="0" w:type="auto"/>
+            <w:hideMark/>
+          </w:tcPr>
+          <w:p>
+            <w:pPr>
+              <w:spacing w:beforeLines="20" w:before="48" w:afterLines="20" w:after="48" w:line="259" w:lineRule="auto"/>
+              <w:rPr>
+                <w:rFonts w:ascii="Times New Roman" w:hAnsi="Times New Roman" w:cs="Times New Roman"/>
+                <w:sz w:val="20"/>
+                <w:szCs w:val="20"/>
+                <w:lang w:val="en-ID"/>
+              </w:rPr>
+            </w:pPr>
+            <w:r>
+              <w:rPr>
+                <w:rFonts w:ascii="Times New Roman" w:hAnsi="Times New Roman" w:cs="Times New Roman"/>
+                <w:sz w:val="20"/>
+                <w:szCs w:val="20"/>
+                <w:lang w:val="en-ID"/>
+              </w:rPr>
+              <w:t>Sistem mengurangi saldo setelah pembelian makanan/minuman</w:t>
             </w:r>
           </w:p>
         </w:tc>
@@ -1791,7 +2801,7 @@
                 <w:szCs w:val="20"/>
                 <w:lang w:val="en-ID"/>
               </w:rPr>
-              <w:t>Data pembayaran</w:t>
+              <w:t>Saldo customer, Total harga</w:t>
             </w:r>
           </w:p>
         </w:tc>
@@ -1829,52 +2839,53 @@
         <w:tc>
           <w:tcPr>
             <w:tcW w:w="0" w:type="auto"/>
-            <w:hideMark/>
-          </w:tcPr>
-          <w:p>
-            <w:pPr>
-              <w:spacing w:beforeLines="20" w:before="48" w:afterLines="20" w:after="48" w:line="259" w:lineRule="auto"/>
-              <w:rPr>
-                <w:rFonts w:ascii="Times New Roman" w:hAnsi="Times New Roman" w:cs="Times New Roman"/>
-                <w:sz w:val="20"/>
-                <w:szCs w:val="20"/>
-                <w:lang w:val="en-ID"/>
-              </w:rPr>
-            </w:pPr>
-            <w:r>
-              <w:rPr>
-                <w:rFonts w:ascii="Times New Roman" w:hAnsi="Times New Roman" w:cs="Times New Roman"/>
-                <w:sz w:val="20"/>
-                <w:szCs w:val="20"/>
-                <w:lang w:val="en-ID"/>
-              </w:rPr>
-              <w:t>Penambahan Saldo</w:t>
-            </w:r>
-          </w:p>
-        </w:tc>
-        <w:tc>
-          <w:tcPr>
-            <w:tcW w:w="0" w:type="auto"/>
-            <w:hideMark/>
-          </w:tcPr>
-          <w:p>
-            <w:pPr>
-              <w:spacing w:beforeLines="20" w:before="48" w:afterLines="20" w:after="48" w:line="259" w:lineRule="auto"/>
-              <w:rPr>
-                <w:rFonts w:ascii="Times New Roman" w:hAnsi="Times New Roman" w:cs="Times New Roman"/>
-                <w:sz w:val="20"/>
-                <w:szCs w:val="20"/>
-                <w:lang w:val="en-ID"/>
-              </w:rPr>
-            </w:pPr>
-            <w:r>
-              <w:rPr>
-                <w:rFonts w:ascii="Times New Roman" w:hAnsi="Times New Roman" w:cs="Times New Roman"/>
-                <w:sz w:val="20"/>
-                <w:szCs w:val="20"/>
-                <w:lang w:val="en-ID"/>
-              </w:rPr>
-              <w:t>Sistem menambahkan saldo setelah pembayaran berhasil</w:t>
+            <w:shd w:val="clear" w:color="auto" w:fill="D5DCE4" w:themeFill="text2" w:themeFillTint="33"/>
+            <w:hideMark/>
+          </w:tcPr>
+          <w:p>
+            <w:pPr>
+              <w:spacing w:beforeLines="20" w:before="48" w:afterLines="20" w:after="48" w:line="259" w:lineRule="auto"/>
+              <w:rPr>
+                <w:rFonts w:ascii="Times New Roman" w:hAnsi="Times New Roman" w:cs="Times New Roman"/>
+                <w:sz w:val="20"/>
+                <w:szCs w:val="20"/>
+                <w:lang w:val="en-ID"/>
+              </w:rPr>
+            </w:pPr>
+            <w:r>
+              <w:rPr>
+                <w:rFonts w:ascii="Times New Roman" w:hAnsi="Times New Roman" w:cs="Times New Roman"/>
+                <w:sz w:val="20"/>
+                <w:szCs w:val="20"/>
+                <w:lang w:val="en-ID"/>
+              </w:rPr>
+              <w:t>Top Up Saldo</w:t>
+            </w:r>
+          </w:p>
+        </w:tc>
+        <w:tc>
+          <w:tcPr>
+            <w:tcW w:w="0" w:type="auto"/>
+            <w:hideMark/>
+          </w:tcPr>
+          <w:p>
+            <w:pPr>
+              <w:spacing w:beforeLines="20" w:before="48" w:afterLines="20" w:after="48" w:line="259" w:lineRule="auto"/>
+              <w:rPr>
+                <w:rFonts w:ascii="Times New Roman" w:hAnsi="Times New Roman" w:cs="Times New Roman"/>
+                <w:sz w:val="20"/>
+                <w:szCs w:val="20"/>
+                <w:lang w:val="en-ID"/>
+              </w:rPr>
+            </w:pPr>
+            <w:r>
+              <w:rPr>
+                <w:rFonts w:ascii="Times New Roman" w:hAnsi="Times New Roman" w:cs="Times New Roman"/>
+                <w:sz w:val="20"/>
+                <w:szCs w:val="20"/>
+                <w:lang w:val="en-ID"/>
+              </w:rPr>
+              <w:t>Customer memilih nominal top up</w:t>
             </w:r>
           </w:p>
         </w:tc>
@@ -1900,7 +2911,7 @@
                 <w:szCs w:val="20"/>
                 <w:lang w:val="en-ID"/>
               </w:rPr>
-              <w:t>Status pembayaran, Saldo customer</w:t>
+              <w:t>Nominal top up</w:t>
             </w:r>
           </w:p>
         </w:tc>
@@ -1938,52 +2949,53 @@
         <w:tc>
           <w:tcPr>
             <w:tcW w:w="0" w:type="auto"/>
-            <w:hideMark/>
-          </w:tcPr>
-          <w:p>
-            <w:pPr>
-              <w:spacing w:beforeLines="20" w:before="48" w:afterLines="20" w:after="48" w:line="259" w:lineRule="auto"/>
-              <w:rPr>
-                <w:rFonts w:ascii="Times New Roman" w:hAnsi="Times New Roman" w:cs="Times New Roman"/>
-                <w:sz w:val="20"/>
-                <w:szCs w:val="20"/>
-                <w:lang w:val="en-ID"/>
-              </w:rPr>
-            </w:pPr>
-            <w:r>
-              <w:rPr>
-                <w:rFonts w:ascii="Times New Roman" w:hAnsi="Times New Roman" w:cs="Times New Roman"/>
-                <w:sz w:val="20"/>
-                <w:szCs w:val="20"/>
-                <w:lang w:val="en-ID"/>
-              </w:rPr>
-              <w:t>Riwayat Transaksi</w:t>
-            </w:r>
-          </w:p>
-        </w:tc>
-        <w:tc>
-          <w:tcPr>
-            <w:tcW w:w="0" w:type="auto"/>
-            <w:hideMark/>
-          </w:tcPr>
-          <w:p>
-            <w:pPr>
-              <w:spacing w:beforeLines="20" w:before="48" w:afterLines="20" w:after="48" w:line="259" w:lineRule="auto"/>
-              <w:rPr>
-                <w:rFonts w:ascii="Times New Roman" w:hAnsi="Times New Roman" w:cs="Times New Roman"/>
-                <w:sz w:val="20"/>
-                <w:szCs w:val="20"/>
-                <w:lang w:val="en-ID"/>
-              </w:rPr>
-            </w:pPr>
-            <w:r>
-              <w:rPr>
-                <w:rFonts w:ascii="Times New Roman" w:hAnsi="Times New Roman" w:cs="Times New Roman"/>
-                <w:sz w:val="20"/>
-                <w:szCs w:val="20"/>
-                <w:lang w:val="en-ID"/>
-              </w:rPr>
-              <w:t>Sistem menyimpan dan menampilkan riwayat transaksi</w:t>
+            <w:shd w:val="clear" w:color="auto" w:fill="D5DCE4" w:themeFill="text2" w:themeFillTint="33"/>
+            <w:hideMark/>
+          </w:tcPr>
+          <w:p>
+            <w:pPr>
+              <w:spacing w:beforeLines="20" w:before="48" w:afterLines="20" w:after="48" w:line="259" w:lineRule="auto"/>
+              <w:rPr>
+                <w:rFonts w:ascii="Times New Roman" w:hAnsi="Times New Roman" w:cs="Times New Roman"/>
+                <w:sz w:val="20"/>
+                <w:szCs w:val="20"/>
+                <w:lang w:val="en-ID"/>
+              </w:rPr>
+            </w:pPr>
+            <w:r>
+              <w:rPr>
+                <w:rFonts w:ascii="Times New Roman" w:hAnsi="Times New Roman" w:cs="Times New Roman"/>
+                <w:sz w:val="20"/>
+                <w:szCs w:val="20"/>
+                <w:lang w:val="en-ID"/>
+              </w:rPr>
+              <w:t>Payment Gateway</w:t>
+            </w:r>
+          </w:p>
+        </w:tc>
+        <w:tc>
+          <w:tcPr>
+            <w:tcW w:w="0" w:type="auto"/>
+            <w:hideMark/>
+          </w:tcPr>
+          <w:p>
+            <w:pPr>
+              <w:spacing w:beforeLines="20" w:before="48" w:afterLines="20" w:after="48" w:line="259" w:lineRule="auto"/>
+              <w:rPr>
+                <w:rFonts w:ascii="Times New Roman" w:hAnsi="Times New Roman" w:cs="Times New Roman"/>
+                <w:sz w:val="20"/>
+                <w:szCs w:val="20"/>
+                <w:lang w:val="en-ID"/>
+              </w:rPr>
+            </w:pPr>
+            <w:r>
+              <w:rPr>
+                <w:rFonts w:ascii="Times New Roman" w:hAnsi="Times New Roman" w:cs="Times New Roman"/>
+                <w:sz w:val="20"/>
+                <w:szCs w:val="20"/>
+                <w:lang w:val="en-ID"/>
+              </w:rPr>
+              <w:t>Sistem memproses pembayaran melalui payment gateway</w:t>
             </w:r>
           </w:p>
         </w:tc>
@@ -2009,7 +3021,7 @@
                 <w:szCs w:val="20"/>
                 <w:lang w:val="en-ID"/>
               </w:rPr>
-              <w:t>Jenis transaksi, Jumlah koin, Rupiah</w:t>
+              <w:t>Data pembayaran</w:t>
             </w:r>
           </w:p>
         </w:tc>
@@ -2047,92 +3059,91 @@
         <w:tc>
           <w:tcPr>
             <w:tcW w:w="0" w:type="auto"/>
-            <w:hideMark/>
-          </w:tcPr>
-          <w:p>
-            <w:pPr>
-              <w:spacing w:beforeLines="20" w:before="48" w:afterLines="20" w:after="48" w:line="259" w:lineRule="auto"/>
-              <w:rPr>
-                <w:rFonts w:ascii="Times New Roman" w:hAnsi="Times New Roman" w:cs="Times New Roman"/>
-                <w:sz w:val="20"/>
-                <w:szCs w:val="20"/>
-                <w:lang w:val="en-ID"/>
-              </w:rPr>
-            </w:pPr>
-            <w:r>
-              <w:rPr>
-                <w:rFonts w:ascii="Times New Roman" w:hAnsi="Times New Roman" w:cs="Times New Roman"/>
-                <w:sz w:val="20"/>
-                <w:szCs w:val="20"/>
-                <w:lang w:val="en-ID"/>
-              </w:rPr>
-              <w:t>Laporan Transaksi</w:t>
-            </w:r>
-          </w:p>
-        </w:tc>
-        <w:tc>
-          <w:tcPr>
-            <w:tcW w:w="0" w:type="auto"/>
-            <w:hideMark/>
-          </w:tcPr>
-          <w:p>
-            <w:pPr>
-              <w:spacing w:beforeLines="20" w:before="48" w:afterLines="20" w:after="48" w:line="259" w:lineRule="auto"/>
-              <w:rPr>
-                <w:rFonts w:ascii="Times New Roman" w:hAnsi="Times New Roman" w:cs="Times New Roman"/>
-                <w:sz w:val="20"/>
-                <w:szCs w:val="20"/>
-                <w:lang w:val="en-ID"/>
-              </w:rPr>
-            </w:pPr>
-            <w:r>
-              <w:rPr>
-                <w:rFonts w:ascii="Times New Roman" w:hAnsi="Times New Roman" w:cs="Times New Roman"/>
-                <w:sz w:val="20"/>
-                <w:szCs w:val="20"/>
-                <w:lang w:val="en-ID"/>
-              </w:rPr>
-              <w:t>Sistem menampilkan laporan transaksi</w:t>
+            <w:shd w:val="clear" w:color="auto" w:fill="D5DCE4" w:themeFill="text2" w:themeFillTint="33"/>
+          </w:tcPr>
+          <w:p>
+            <w:pPr>
+              <w:spacing w:beforeLines="20" w:before="48" w:afterLines="20" w:after="48"/>
+              <w:rPr>
+                <w:rFonts w:ascii="Times New Roman" w:hAnsi="Times New Roman" w:cs="Times New Roman"/>
+                <w:sz w:val="20"/>
+                <w:szCs w:val="20"/>
+                <w:lang w:val="en-ID"/>
+              </w:rPr>
+            </w:pPr>
+            <w:r>
+              <w:rPr>
+                <w:rFonts w:ascii="Times New Roman" w:hAnsi="Times New Roman" w:cs="Times New Roman"/>
+                <w:sz w:val="20"/>
+                <w:szCs w:val="20"/>
+                <w:lang w:val="en-ID"/>
+              </w:rPr>
+              <w:t>Proses Pembayaran</w:t>
+            </w:r>
+          </w:p>
+        </w:tc>
+        <w:tc>
+          <w:tcPr>
+            <w:tcW w:w="0" w:type="auto"/>
+          </w:tcPr>
+          <w:p>
+            <w:pPr>
+              <w:spacing w:beforeLines="20" w:before="48" w:afterLines="20" w:after="48"/>
+              <w:rPr>
+                <w:rFonts w:ascii="Times New Roman" w:hAnsi="Times New Roman" w:cs="Times New Roman"/>
+                <w:sz w:val="20"/>
+                <w:szCs w:val="20"/>
+                <w:lang w:val="en-ID"/>
+              </w:rPr>
+            </w:pPr>
+            <w:r>
+              <w:rPr>
+                <w:rFonts w:ascii="Times New Roman" w:hAnsi="Times New Roman" w:cs="Times New Roman"/>
+                <w:sz w:val="20"/>
+                <w:szCs w:val="20"/>
+                <w:lang w:val="en-ID"/>
+              </w:rPr>
+              <w:t>Sistem mengirim request pembayaran dan menerima status pembayaran</w:t>
             </w:r>
           </w:p>
         </w:tc>
         <w:tc>
           <w:tcPr>
             <w:tcW w:w="2233" w:type="dxa"/>
-            <w:hideMark/>
-          </w:tcPr>
-          <w:p>
-            <w:pPr>
-              <w:spacing w:beforeLines="20" w:before="48" w:afterLines="20" w:after="48" w:line="259" w:lineRule="auto"/>
-              <w:rPr>
-                <w:rFonts w:ascii="Times New Roman" w:hAnsi="Times New Roman" w:cs="Times New Roman"/>
-                <w:sz w:val="20"/>
-                <w:szCs w:val="20"/>
-                <w:lang w:val="en-ID"/>
-              </w:rPr>
-            </w:pPr>
-            <w:r>
-              <w:rPr>
-                <w:rFonts w:ascii="Times New Roman" w:hAnsi="Times New Roman" w:cs="Times New Roman"/>
-                <w:sz w:val="20"/>
-                <w:szCs w:val="20"/>
-                <w:lang w:val="en-ID"/>
-              </w:rPr>
-              <w:t>Data transaksi</w:t>
+          </w:tcPr>
+          <w:p>
+            <w:pPr>
+              <w:spacing w:beforeLines="20" w:before="48" w:afterLines="20" w:after="48"/>
+              <w:rPr>
+                <w:rFonts w:ascii="Times New Roman" w:hAnsi="Times New Roman" w:cs="Times New Roman"/>
+                <w:sz w:val="20"/>
+                <w:szCs w:val="20"/>
+                <w:lang w:val="en-ID"/>
+              </w:rPr>
+            </w:pPr>
+            <w:r>
+              <w:rPr>
+                <w:rFonts w:ascii="Times New Roman" w:hAnsi="Times New Roman" w:cs="Times New Roman"/>
+                <w:sz w:val="20"/>
+                <w:szCs w:val="20"/>
+                <w:lang w:val="en-ID"/>
+              </w:rPr>
+              <w:t>Data payment gateway</w:t>
             </w:r>
           </w:p>
         </w:tc>
         <w:tc>
           <w:tcPr>
             <w:tcW w:w="1224" w:type="dxa"/>
-            <w:hideMark/>
-          </w:tcPr>
-          <w:p>
-            <w:pPr>
-              <w:spacing w:beforeLines="20" w:before="48" w:afterLines="20" w:after="48" w:line="259" w:lineRule="auto"/>
+          </w:tcPr>
+          <w:p>
+            <w:pPr>
+              <w:spacing w:beforeLines="20" w:before="48" w:afterLines="20" w:after="48"/>
               <w:jc w:val="center"/>
               <w:rPr>
                 <w:rFonts w:ascii="Times New Roman" w:hAnsi="Times New Roman" w:cs="Times New Roman"/>
+                <w:b/>
+                <w:bCs/>
                 <w:sz w:val="20"/>
                 <w:szCs w:val="20"/>
                 <w:lang w:val="en-ID"/>
@@ -2156,52 +3167,53 @@
         <w:tc>
           <w:tcPr>
             <w:tcW w:w="0" w:type="auto"/>
-            <w:hideMark/>
-          </w:tcPr>
-          <w:p>
-            <w:pPr>
-              <w:spacing w:beforeLines="20" w:before="48" w:afterLines="20" w:after="48" w:line="259" w:lineRule="auto"/>
-              <w:rPr>
-                <w:rFonts w:ascii="Times New Roman" w:hAnsi="Times New Roman" w:cs="Times New Roman"/>
-                <w:sz w:val="20"/>
-                <w:szCs w:val="20"/>
-                <w:lang w:val="en-ID"/>
-              </w:rPr>
-            </w:pPr>
-            <w:r>
-              <w:rPr>
-                <w:rFonts w:ascii="Times New Roman" w:hAnsi="Times New Roman" w:cs="Times New Roman"/>
-                <w:sz w:val="20"/>
-                <w:szCs w:val="20"/>
-                <w:lang w:val="en-ID"/>
-              </w:rPr>
-              <w:t>Laporan Keuangan</w:t>
-            </w:r>
-          </w:p>
-        </w:tc>
-        <w:tc>
-          <w:tcPr>
-            <w:tcW w:w="0" w:type="auto"/>
-            <w:hideMark/>
-          </w:tcPr>
-          <w:p>
-            <w:pPr>
-              <w:spacing w:beforeLines="20" w:before="48" w:afterLines="20" w:after="48" w:line="259" w:lineRule="auto"/>
-              <w:rPr>
-                <w:rFonts w:ascii="Times New Roman" w:hAnsi="Times New Roman" w:cs="Times New Roman"/>
-                <w:sz w:val="20"/>
-                <w:szCs w:val="20"/>
-                <w:lang w:val="en-ID"/>
-              </w:rPr>
-            </w:pPr>
-            <w:r>
-              <w:rPr>
-                <w:rFonts w:ascii="Times New Roman" w:hAnsi="Times New Roman" w:cs="Times New Roman"/>
-                <w:sz w:val="20"/>
-                <w:szCs w:val="20"/>
-                <w:lang w:val="en-ID"/>
-              </w:rPr>
-              <w:t>Sistem menampilkan total pemasukan dalam koin dan rupiah</w:t>
+            <w:shd w:val="clear" w:color="auto" w:fill="D5DCE4" w:themeFill="text2" w:themeFillTint="33"/>
+            <w:hideMark/>
+          </w:tcPr>
+          <w:p>
+            <w:pPr>
+              <w:spacing w:beforeLines="20" w:before="48" w:afterLines="20" w:after="48" w:line="259" w:lineRule="auto"/>
+              <w:rPr>
+                <w:rFonts w:ascii="Times New Roman" w:hAnsi="Times New Roman" w:cs="Times New Roman"/>
+                <w:sz w:val="20"/>
+                <w:szCs w:val="20"/>
+                <w:lang w:val="en-ID"/>
+              </w:rPr>
+            </w:pPr>
+            <w:r>
+              <w:rPr>
+                <w:rFonts w:ascii="Times New Roman" w:hAnsi="Times New Roman" w:cs="Times New Roman"/>
+                <w:sz w:val="20"/>
+                <w:szCs w:val="20"/>
+                <w:lang w:val="en-ID"/>
+              </w:rPr>
+              <w:t>Penambahan Saldo</w:t>
+            </w:r>
+          </w:p>
+        </w:tc>
+        <w:tc>
+          <w:tcPr>
+            <w:tcW w:w="0" w:type="auto"/>
+            <w:hideMark/>
+          </w:tcPr>
+          <w:p>
+            <w:pPr>
+              <w:spacing w:beforeLines="20" w:before="48" w:afterLines="20" w:after="48" w:line="259" w:lineRule="auto"/>
+              <w:rPr>
+                <w:rFonts w:ascii="Times New Roman" w:hAnsi="Times New Roman" w:cs="Times New Roman"/>
+                <w:sz w:val="20"/>
+                <w:szCs w:val="20"/>
+                <w:lang w:val="en-ID"/>
+              </w:rPr>
+            </w:pPr>
+            <w:r>
+              <w:rPr>
+                <w:rFonts w:ascii="Times New Roman" w:hAnsi="Times New Roman" w:cs="Times New Roman"/>
+                <w:sz w:val="20"/>
+                <w:szCs w:val="20"/>
+                <w:lang w:val="en-ID"/>
+              </w:rPr>
+              <w:t>Sistem menambahkan saldo setelah pembayaran berhasil</w:t>
             </w:r>
           </w:p>
         </w:tc>
@@ -2227,7 +3239,7 @@
                 <w:szCs w:val="20"/>
                 <w:lang w:val="en-ID"/>
               </w:rPr>
-              <w:t>Data transaksi keuangan</w:t>
+              <w:t>Status pembayaran, Saldo customer</w:t>
             </w:r>
           </w:p>
         </w:tc>
@@ -2265,92 +3277,91 @@
         <w:tc>
           <w:tcPr>
             <w:tcW w:w="0" w:type="auto"/>
-            <w:hideMark/>
-          </w:tcPr>
-          <w:p>
-            <w:pPr>
-              <w:spacing w:beforeLines="20" w:before="48" w:afterLines="20" w:after="48" w:line="259" w:lineRule="auto"/>
-              <w:rPr>
-                <w:rFonts w:ascii="Times New Roman" w:hAnsi="Times New Roman" w:cs="Times New Roman"/>
-                <w:sz w:val="20"/>
-                <w:szCs w:val="20"/>
-                <w:lang w:val="en-ID"/>
-              </w:rPr>
-            </w:pPr>
-            <w:r>
-              <w:rPr>
-                <w:rFonts w:ascii="Times New Roman" w:hAnsi="Times New Roman" w:cs="Times New Roman"/>
-                <w:sz w:val="20"/>
-                <w:szCs w:val="20"/>
-                <w:lang w:val="en-ID"/>
-              </w:rPr>
-              <w:t>Download Laporan</w:t>
-            </w:r>
-          </w:p>
-        </w:tc>
-        <w:tc>
-          <w:tcPr>
-            <w:tcW w:w="0" w:type="auto"/>
-            <w:hideMark/>
-          </w:tcPr>
-          <w:p>
-            <w:pPr>
-              <w:spacing w:beforeLines="20" w:before="48" w:afterLines="20" w:after="48" w:line="259" w:lineRule="auto"/>
-              <w:rPr>
-                <w:rFonts w:ascii="Times New Roman" w:hAnsi="Times New Roman" w:cs="Times New Roman"/>
-                <w:sz w:val="20"/>
-                <w:szCs w:val="20"/>
-                <w:lang w:val="en-ID"/>
-              </w:rPr>
-            </w:pPr>
-            <w:r>
-              <w:rPr>
-                <w:rFonts w:ascii="Times New Roman" w:hAnsi="Times New Roman" w:cs="Times New Roman"/>
-                <w:sz w:val="20"/>
-                <w:szCs w:val="20"/>
-                <w:lang w:val="en-ID"/>
-              </w:rPr>
-              <w:t>Admin mengunduh laporan transaksi</w:t>
+            <w:shd w:val="clear" w:color="auto" w:fill="D5DCE4" w:themeFill="text2" w:themeFillTint="33"/>
+          </w:tcPr>
+          <w:p>
+            <w:pPr>
+              <w:spacing w:beforeLines="20" w:before="48" w:afterLines="20" w:after="48"/>
+              <w:rPr>
+                <w:rFonts w:ascii="Times New Roman" w:hAnsi="Times New Roman" w:cs="Times New Roman"/>
+                <w:sz w:val="20"/>
+                <w:szCs w:val="20"/>
+                <w:lang w:val="en-ID"/>
+              </w:rPr>
+            </w:pPr>
+            <w:r>
+              <w:rPr>
+                <w:rFonts w:ascii="Times New Roman" w:hAnsi="Times New Roman" w:cs="Times New Roman"/>
+                <w:sz w:val="20"/>
+                <w:szCs w:val="20"/>
+                <w:lang w:val="en-ID"/>
+              </w:rPr>
+              <w:t>Pembayaran Gagal</w:t>
+            </w:r>
+          </w:p>
+        </w:tc>
+        <w:tc>
+          <w:tcPr>
+            <w:tcW w:w="0" w:type="auto"/>
+          </w:tcPr>
+          <w:p>
+            <w:pPr>
+              <w:spacing w:beforeLines="20" w:before="48" w:afterLines="20" w:after="48"/>
+              <w:rPr>
+                <w:rFonts w:ascii="Times New Roman" w:hAnsi="Times New Roman" w:cs="Times New Roman"/>
+                <w:sz w:val="20"/>
+                <w:szCs w:val="20"/>
+                <w:lang w:val="en-ID"/>
+              </w:rPr>
+            </w:pPr>
+            <w:r>
+              <w:rPr>
+                <w:rFonts w:ascii="Times New Roman" w:hAnsi="Times New Roman" w:cs="Times New Roman"/>
+                <w:sz w:val="20"/>
+                <w:szCs w:val="20"/>
+                <w:lang w:val="en-ID"/>
+              </w:rPr>
+              <w:t>Sistem tidak menambahkan saldo jika pembayaran gagal</w:t>
             </w:r>
           </w:p>
         </w:tc>
         <w:tc>
           <w:tcPr>
             <w:tcW w:w="2233" w:type="dxa"/>
-            <w:hideMark/>
-          </w:tcPr>
-          <w:p>
-            <w:pPr>
-              <w:spacing w:beforeLines="20" w:before="48" w:afterLines="20" w:after="48" w:line="259" w:lineRule="auto"/>
-              <w:rPr>
-                <w:rFonts w:ascii="Times New Roman" w:hAnsi="Times New Roman" w:cs="Times New Roman"/>
-                <w:sz w:val="20"/>
-                <w:szCs w:val="20"/>
-                <w:lang w:val="en-ID"/>
-              </w:rPr>
-            </w:pPr>
-            <w:r>
-              <w:rPr>
-                <w:rFonts w:ascii="Times New Roman" w:hAnsi="Times New Roman" w:cs="Times New Roman"/>
-                <w:sz w:val="20"/>
-                <w:szCs w:val="20"/>
-                <w:lang w:val="en-ID"/>
-              </w:rPr>
-              <w:t>File laporan</w:t>
+          </w:tcPr>
+          <w:p>
+            <w:pPr>
+              <w:spacing w:beforeLines="20" w:before="48" w:afterLines="20" w:after="48"/>
+              <w:rPr>
+                <w:rFonts w:ascii="Times New Roman" w:hAnsi="Times New Roman" w:cs="Times New Roman"/>
+                <w:sz w:val="20"/>
+                <w:szCs w:val="20"/>
+                <w:lang w:val="en-ID"/>
+              </w:rPr>
+            </w:pPr>
+            <w:r>
+              <w:rPr>
+                <w:rFonts w:ascii="Times New Roman" w:hAnsi="Times New Roman" w:cs="Times New Roman"/>
+                <w:sz w:val="20"/>
+                <w:szCs w:val="20"/>
+                <w:lang w:val="en-ID"/>
+              </w:rPr>
+              <w:t>Status pembayaran gagal</w:t>
             </w:r>
           </w:p>
         </w:tc>
         <w:tc>
           <w:tcPr>
             <w:tcW w:w="1224" w:type="dxa"/>
-            <w:hideMark/>
-          </w:tcPr>
-          <w:p>
-            <w:pPr>
-              <w:spacing w:beforeLines="20" w:before="48" w:afterLines="20" w:after="48" w:line="259" w:lineRule="auto"/>
+          </w:tcPr>
+          <w:p>
+            <w:pPr>
+              <w:spacing w:beforeLines="20" w:before="48" w:afterLines="20" w:after="48"/>
               <w:jc w:val="center"/>
               <w:rPr>
                 <w:rFonts w:ascii="Times New Roman" w:hAnsi="Times New Roman" w:cs="Times New Roman"/>
+                <w:b/>
+                <w:bCs/>
                 <w:sz w:val="20"/>
                 <w:szCs w:val="20"/>
                 <w:lang w:val="en-ID"/>
@@ -2374,52 +3385,53 @@
         <w:tc>
           <w:tcPr>
             <w:tcW w:w="0" w:type="auto"/>
-            <w:hideMark/>
-          </w:tcPr>
-          <w:p>
-            <w:pPr>
-              <w:spacing w:beforeLines="20" w:before="48" w:afterLines="20" w:after="48" w:line="259" w:lineRule="auto"/>
-              <w:rPr>
-                <w:rFonts w:ascii="Times New Roman" w:hAnsi="Times New Roman" w:cs="Times New Roman"/>
-                <w:sz w:val="20"/>
-                <w:szCs w:val="20"/>
-                <w:lang w:val="en-ID"/>
-              </w:rPr>
-            </w:pPr>
-            <w:r>
-              <w:rPr>
-                <w:rFonts w:ascii="Times New Roman" w:hAnsi="Times New Roman" w:cs="Times New Roman"/>
-                <w:sz w:val="20"/>
-                <w:szCs w:val="20"/>
-                <w:lang w:val="en-ID"/>
-              </w:rPr>
-              <w:t>Kelola Akun Customer</w:t>
-            </w:r>
-          </w:p>
-        </w:tc>
-        <w:tc>
-          <w:tcPr>
-            <w:tcW w:w="0" w:type="auto"/>
-            <w:hideMark/>
-          </w:tcPr>
-          <w:p>
-            <w:pPr>
-              <w:spacing w:beforeLines="20" w:before="48" w:afterLines="20" w:after="48" w:line="259" w:lineRule="auto"/>
-              <w:rPr>
-                <w:rFonts w:ascii="Times New Roman" w:hAnsi="Times New Roman" w:cs="Times New Roman"/>
-                <w:sz w:val="20"/>
-                <w:szCs w:val="20"/>
-                <w:lang w:val="en-ID"/>
-              </w:rPr>
-            </w:pPr>
-            <w:r>
-              <w:rPr>
-                <w:rFonts w:ascii="Times New Roman" w:hAnsi="Times New Roman" w:cs="Times New Roman"/>
-                <w:sz w:val="20"/>
-                <w:szCs w:val="20"/>
-                <w:lang w:val="en-ID"/>
-              </w:rPr>
-              <w:t>Customer mengubah username atau password akun</w:t>
+            <w:shd w:val="clear" w:color="auto" w:fill="FFCE3C"/>
+            <w:hideMark/>
+          </w:tcPr>
+          <w:p>
+            <w:pPr>
+              <w:spacing w:beforeLines="20" w:before="48" w:afterLines="20" w:after="48" w:line="259" w:lineRule="auto"/>
+              <w:rPr>
+                <w:rFonts w:ascii="Times New Roman" w:hAnsi="Times New Roman" w:cs="Times New Roman"/>
+                <w:sz w:val="20"/>
+                <w:szCs w:val="20"/>
+                <w:lang w:val="en-ID"/>
+              </w:rPr>
+            </w:pPr>
+            <w:r>
+              <w:rPr>
+                <w:rFonts w:ascii="Times New Roman" w:hAnsi="Times New Roman" w:cs="Times New Roman"/>
+                <w:sz w:val="20"/>
+                <w:szCs w:val="20"/>
+                <w:lang w:val="en-ID"/>
+              </w:rPr>
+              <w:t>Riwayat Transaksi</w:t>
+            </w:r>
+          </w:p>
+        </w:tc>
+        <w:tc>
+          <w:tcPr>
+            <w:tcW w:w="0" w:type="auto"/>
+            <w:hideMark/>
+          </w:tcPr>
+          <w:p>
+            <w:pPr>
+              <w:spacing w:beforeLines="20" w:before="48" w:afterLines="20" w:after="48" w:line="259" w:lineRule="auto"/>
+              <w:rPr>
+                <w:rFonts w:ascii="Times New Roman" w:hAnsi="Times New Roman" w:cs="Times New Roman"/>
+                <w:sz w:val="20"/>
+                <w:szCs w:val="20"/>
+                <w:lang w:val="en-ID"/>
+              </w:rPr>
+            </w:pPr>
+            <w:r>
+              <w:rPr>
+                <w:rFonts w:ascii="Times New Roman" w:hAnsi="Times New Roman" w:cs="Times New Roman"/>
+                <w:sz w:val="20"/>
+                <w:szCs w:val="20"/>
+                <w:lang w:val="en-ID"/>
+              </w:rPr>
+              <w:t>Sistem menyimpan dan menampilkan riwayat transaksi</w:t>
             </w:r>
           </w:p>
         </w:tc>
@@ -2445,7 +3457,7 @@
                 <w:szCs w:val="20"/>
                 <w:lang w:val="en-ID"/>
               </w:rPr>
-              <w:t>Username baru, Password baru</w:t>
+              <w:t>Jenis transaksi, Jumlah koin, Rupiah</w:t>
             </w:r>
           </w:p>
         </w:tc>
@@ -2483,93 +3495,91 @@
         <w:tc>
           <w:tcPr>
             <w:tcW w:w="0" w:type="auto"/>
-            <w:hideMark/>
-          </w:tcPr>
-          <w:p>
-            <w:pPr>
-              <w:spacing w:beforeLines="20" w:before="48" w:afterLines="20" w:after="48" w:line="259" w:lineRule="auto"/>
-              <w:rPr>
-                <w:rFonts w:ascii="Times New Roman" w:hAnsi="Times New Roman" w:cs="Times New Roman"/>
-                <w:sz w:val="20"/>
-                <w:szCs w:val="20"/>
-                <w:lang w:val="en-ID"/>
-              </w:rPr>
-            </w:pPr>
-            <w:r>
-              <w:rPr>
-                <w:rFonts w:ascii="Times New Roman" w:hAnsi="Times New Roman" w:cs="Times New Roman"/>
-                <w:sz w:val="20"/>
-                <w:szCs w:val="20"/>
-                <w:lang w:val="en-ID"/>
-              </w:rPr>
-              <w:lastRenderedPageBreak/>
-              <w:t>Kelola Akun oleh Admin</w:t>
-            </w:r>
-          </w:p>
-        </w:tc>
-        <w:tc>
-          <w:tcPr>
-            <w:tcW w:w="0" w:type="auto"/>
-            <w:hideMark/>
-          </w:tcPr>
-          <w:p>
-            <w:pPr>
-              <w:spacing w:beforeLines="20" w:before="48" w:afterLines="20" w:after="48" w:line="259" w:lineRule="auto"/>
-              <w:rPr>
-                <w:rFonts w:ascii="Times New Roman" w:hAnsi="Times New Roman" w:cs="Times New Roman"/>
-                <w:sz w:val="20"/>
-                <w:szCs w:val="20"/>
-                <w:lang w:val="en-ID"/>
-              </w:rPr>
-            </w:pPr>
-            <w:r>
-              <w:rPr>
-                <w:rFonts w:ascii="Times New Roman" w:hAnsi="Times New Roman" w:cs="Times New Roman"/>
-                <w:sz w:val="20"/>
-                <w:szCs w:val="20"/>
-                <w:lang w:val="en-ID"/>
-              </w:rPr>
-              <w:t>Admin reset password atau menghapus akun customer</w:t>
+            <w:shd w:val="clear" w:color="auto" w:fill="FFCE3C"/>
+          </w:tcPr>
+          <w:p>
+            <w:pPr>
+              <w:spacing w:beforeLines="20" w:before="48" w:afterLines="20" w:after="48"/>
+              <w:rPr>
+                <w:rFonts w:ascii="Times New Roman" w:hAnsi="Times New Roman" w:cs="Times New Roman"/>
+                <w:sz w:val="20"/>
+                <w:szCs w:val="20"/>
+                <w:lang w:val="en-ID"/>
+              </w:rPr>
+            </w:pPr>
+            <w:r>
+              <w:rPr>
+                <w:rFonts w:ascii="Times New Roman" w:hAnsi="Times New Roman" w:cs="Times New Roman"/>
+                <w:sz w:val="20"/>
+                <w:szCs w:val="20"/>
+                <w:lang w:val="en-ID"/>
+              </w:rPr>
+              <w:t>Riwayat Transaksi Customer</w:t>
+            </w:r>
+          </w:p>
+        </w:tc>
+        <w:tc>
+          <w:tcPr>
+            <w:tcW w:w="0" w:type="auto"/>
+          </w:tcPr>
+          <w:p>
+            <w:pPr>
+              <w:spacing w:beforeLines="20" w:before="48" w:afterLines="20" w:after="48"/>
+              <w:rPr>
+                <w:rFonts w:ascii="Times New Roman" w:hAnsi="Times New Roman" w:cs="Times New Roman"/>
+                <w:sz w:val="20"/>
+                <w:szCs w:val="20"/>
+                <w:lang w:val="en-ID"/>
+              </w:rPr>
+            </w:pPr>
+            <w:r>
+              <w:rPr>
+                <w:rFonts w:ascii="Times New Roman" w:hAnsi="Times New Roman" w:cs="Times New Roman"/>
+                <w:sz w:val="20"/>
+                <w:szCs w:val="20"/>
+                <w:lang w:val="en-ID"/>
+              </w:rPr>
+              <w:t>Customer melihat histori transaksi</w:t>
             </w:r>
           </w:p>
         </w:tc>
         <w:tc>
           <w:tcPr>
             <w:tcW w:w="2233" w:type="dxa"/>
-            <w:hideMark/>
-          </w:tcPr>
-          <w:p>
-            <w:pPr>
-              <w:spacing w:beforeLines="20" w:before="48" w:afterLines="20" w:after="48" w:line="259" w:lineRule="auto"/>
-              <w:rPr>
-                <w:rFonts w:ascii="Times New Roman" w:hAnsi="Times New Roman" w:cs="Times New Roman"/>
-                <w:sz w:val="20"/>
-                <w:szCs w:val="20"/>
-                <w:lang w:val="en-ID"/>
-              </w:rPr>
-            </w:pPr>
-            <w:r>
-              <w:rPr>
-                <w:rFonts w:ascii="Times New Roman" w:hAnsi="Times New Roman" w:cs="Times New Roman"/>
-                <w:sz w:val="20"/>
-                <w:szCs w:val="20"/>
-                <w:lang w:val="en-ID"/>
-              </w:rPr>
-              <w:t>Data customer</w:t>
+          </w:tcPr>
+          <w:p>
+            <w:pPr>
+              <w:spacing w:beforeLines="20" w:before="48" w:afterLines="20" w:after="48"/>
+              <w:rPr>
+                <w:rFonts w:ascii="Times New Roman" w:hAnsi="Times New Roman" w:cs="Times New Roman"/>
+                <w:sz w:val="20"/>
+                <w:szCs w:val="20"/>
+                <w:lang w:val="en-ID"/>
+              </w:rPr>
+            </w:pPr>
+            <w:r>
+              <w:rPr>
+                <w:rFonts w:ascii="Times New Roman" w:hAnsi="Times New Roman" w:cs="Times New Roman"/>
+                <w:sz w:val="20"/>
+                <w:szCs w:val="20"/>
+                <w:lang w:val="en-ID"/>
+              </w:rPr>
+              <w:t>Data transaksi customer</w:t>
             </w:r>
           </w:p>
         </w:tc>
         <w:tc>
           <w:tcPr>
             <w:tcW w:w="1224" w:type="dxa"/>
-            <w:hideMark/>
-          </w:tcPr>
-          <w:p>
-            <w:pPr>
-              <w:spacing w:beforeLines="20" w:before="48" w:afterLines="20" w:after="48" w:line="259" w:lineRule="auto"/>
+          </w:tcPr>
+          <w:p>
+            <w:pPr>
+              <w:spacing w:beforeLines="20" w:before="48" w:afterLines="20" w:after="48"/>
               <w:jc w:val="center"/>
               <w:rPr>
                 <w:rFonts w:ascii="Times New Roman" w:hAnsi="Times New Roman" w:cs="Times New Roman"/>
+                <w:b/>
+                <w:bCs/>
                 <w:sz w:val="20"/>
                 <w:szCs w:val="20"/>
                 <w:lang w:val="en-ID"/>
@@ -2593,92 +3603,91 @@
         <w:tc>
           <w:tcPr>
             <w:tcW w:w="0" w:type="auto"/>
-            <w:hideMark/>
-          </w:tcPr>
-          <w:p>
-            <w:pPr>
-              <w:spacing w:beforeLines="20" w:before="48" w:afterLines="20" w:after="48" w:line="259" w:lineRule="auto"/>
-              <w:rPr>
-                <w:rFonts w:ascii="Times New Roman" w:hAnsi="Times New Roman" w:cs="Times New Roman"/>
-                <w:sz w:val="20"/>
-                <w:szCs w:val="20"/>
-                <w:lang w:val="en-ID"/>
-              </w:rPr>
-            </w:pPr>
-            <w:r>
-              <w:rPr>
-                <w:rFonts w:ascii="Times New Roman" w:hAnsi="Times New Roman" w:cs="Times New Roman"/>
-                <w:sz w:val="20"/>
-                <w:szCs w:val="20"/>
-                <w:lang w:val="en-ID"/>
-              </w:rPr>
-              <w:t>Monitoring Status PC</w:t>
-            </w:r>
-          </w:p>
-        </w:tc>
-        <w:tc>
-          <w:tcPr>
-            <w:tcW w:w="0" w:type="auto"/>
-            <w:hideMark/>
-          </w:tcPr>
-          <w:p>
-            <w:pPr>
-              <w:spacing w:beforeLines="20" w:before="48" w:afterLines="20" w:after="48" w:line="259" w:lineRule="auto"/>
-              <w:rPr>
-                <w:rFonts w:ascii="Times New Roman" w:hAnsi="Times New Roman" w:cs="Times New Roman"/>
-                <w:sz w:val="20"/>
-                <w:szCs w:val="20"/>
-                <w:lang w:val="en-ID"/>
-              </w:rPr>
-            </w:pPr>
-            <w:r>
-              <w:rPr>
-                <w:rFonts w:ascii="Times New Roman" w:hAnsi="Times New Roman" w:cs="Times New Roman"/>
-                <w:sz w:val="20"/>
-                <w:szCs w:val="20"/>
-                <w:lang w:val="en-ID"/>
-              </w:rPr>
-              <w:t>Sistem menampilkan status seluruh PC</w:t>
+            <w:shd w:val="clear" w:color="auto" w:fill="FFCE3C"/>
+          </w:tcPr>
+          <w:p>
+            <w:pPr>
+              <w:spacing w:beforeLines="20" w:before="48" w:afterLines="20" w:after="48"/>
+              <w:rPr>
+                <w:rFonts w:ascii="Times New Roman" w:hAnsi="Times New Roman" w:cs="Times New Roman"/>
+                <w:sz w:val="20"/>
+                <w:szCs w:val="20"/>
+                <w:lang w:val="en-ID"/>
+              </w:rPr>
+            </w:pPr>
+            <w:r>
+              <w:rPr>
+                <w:rFonts w:ascii="Times New Roman" w:hAnsi="Times New Roman" w:cs="Times New Roman"/>
+                <w:sz w:val="20"/>
+                <w:szCs w:val="20"/>
+                <w:lang w:val="en-ID"/>
+              </w:rPr>
+              <w:t>Riwayat Transaksi Admin</w:t>
+            </w:r>
+          </w:p>
+        </w:tc>
+        <w:tc>
+          <w:tcPr>
+            <w:tcW w:w="0" w:type="auto"/>
+          </w:tcPr>
+          <w:p>
+            <w:pPr>
+              <w:spacing w:beforeLines="20" w:before="48" w:afterLines="20" w:after="48"/>
+              <w:rPr>
+                <w:rFonts w:ascii="Times New Roman" w:hAnsi="Times New Roman" w:cs="Times New Roman"/>
+                <w:sz w:val="20"/>
+                <w:szCs w:val="20"/>
+                <w:lang w:val="en-ID"/>
+              </w:rPr>
+            </w:pPr>
+            <w:r>
+              <w:rPr>
+                <w:rFonts w:ascii="Times New Roman" w:hAnsi="Times New Roman" w:cs="Times New Roman"/>
+                <w:sz w:val="20"/>
+                <w:szCs w:val="20"/>
+                <w:lang w:val="en-ID"/>
+              </w:rPr>
+              <w:t>Admin melihat seluruh transaksi warnet</w:t>
             </w:r>
           </w:p>
         </w:tc>
         <w:tc>
           <w:tcPr>
             <w:tcW w:w="2233" w:type="dxa"/>
-            <w:hideMark/>
-          </w:tcPr>
-          <w:p>
-            <w:pPr>
-              <w:spacing w:beforeLines="20" w:before="48" w:afterLines="20" w:after="48" w:line="259" w:lineRule="auto"/>
-              <w:rPr>
-                <w:rFonts w:ascii="Times New Roman" w:hAnsi="Times New Roman" w:cs="Times New Roman"/>
-                <w:sz w:val="20"/>
-                <w:szCs w:val="20"/>
-                <w:lang w:val="en-ID"/>
-              </w:rPr>
-            </w:pPr>
-            <w:r>
-              <w:rPr>
-                <w:rFonts w:ascii="Times New Roman" w:hAnsi="Times New Roman" w:cs="Times New Roman"/>
-                <w:sz w:val="20"/>
-                <w:szCs w:val="20"/>
-                <w:lang w:val="en-ID"/>
-              </w:rPr>
-              <w:t>Data status PC</w:t>
+          </w:tcPr>
+          <w:p>
+            <w:pPr>
+              <w:spacing w:beforeLines="20" w:before="48" w:afterLines="20" w:after="48"/>
+              <w:rPr>
+                <w:rFonts w:ascii="Times New Roman" w:hAnsi="Times New Roman" w:cs="Times New Roman"/>
+                <w:sz w:val="20"/>
+                <w:szCs w:val="20"/>
+                <w:lang w:val="en-ID"/>
+              </w:rPr>
+            </w:pPr>
+            <w:r>
+              <w:rPr>
+                <w:rFonts w:ascii="Times New Roman" w:hAnsi="Times New Roman" w:cs="Times New Roman"/>
+                <w:sz w:val="20"/>
+                <w:szCs w:val="20"/>
+                <w:lang w:val="en-ID"/>
+              </w:rPr>
+              <w:t>Data seluruh transaksi</w:t>
             </w:r>
           </w:p>
         </w:tc>
         <w:tc>
           <w:tcPr>
             <w:tcW w:w="1224" w:type="dxa"/>
-            <w:hideMark/>
-          </w:tcPr>
-          <w:p>
-            <w:pPr>
-              <w:spacing w:beforeLines="20" w:before="48" w:afterLines="20" w:after="48" w:line="259" w:lineRule="auto"/>
+          </w:tcPr>
+          <w:p>
+            <w:pPr>
+              <w:spacing w:beforeLines="20" w:before="48" w:afterLines="20" w:after="48"/>
               <w:jc w:val="center"/>
               <w:rPr>
                 <w:rFonts w:ascii="Times New Roman" w:hAnsi="Times New Roman" w:cs="Times New Roman"/>
+                <w:b/>
+                <w:bCs/>
                 <w:sz w:val="20"/>
                 <w:szCs w:val="20"/>
                 <w:lang w:val="en-ID"/>
@@ -2702,52 +3711,53 @@
         <w:tc>
           <w:tcPr>
             <w:tcW w:w="0" w:type="auto"/>
-            <w:hideMark/>
-          </w:tcPr>
-          <w:p>
-            <w:pPr>
-              <w:spacing w:beforeLines="20" w:before="48" w:afterLines="20" w:after="48" w:line="259" w:lineRule="auto"/>
-              <w:rPr>
-                <w:rFonts w:ascii="Times New Roman" w:hAnsi="Times New Roman" w:cs="Times New Roman"/>
-                <w:sz w:val="20"/>
-                <w:szCs w:val="20"/>
-                <w:lang w:val="en-ID"/>
-              </w:rPr>
-            </w:pPr>
-            <w:r>
-              <w:rPr>
-                <w:rFonts w:ascii="Times New Roman" w:hAnsi="Times New Roman" w:cs="Times New Roman"/>
-                <w:sz w:val="20"/>
-                <w:szCs w:val="20"/>
-                <w:lang w:val="en-ID"/>
-              </w:rPr>
-              <w:t>Informasi Sesi PC</w:t>
-            </w:r>
-          </w:p>
-        </w:tc>
-        <w:tc>
-          <w:tcPr>
-            <w:tcW w:w="0" w:type="auto"/>
-            <w:hideMark/>
-          </w:tcPr>
-          <w:p>
-            <w:pPr>
-              <w:spacing w:beforeLines="20" w:before="48" w:afterLines="20" w:after="48" w:line="259" w:lineRule="auto"/>
-              <w:rPr>
-                <w:rFonts w:ascii="Times New Roman" w:hAnsi="Times New Roman" w:cs="Times New Roman"/>
-                <w:sz w:val="20"/>
-                <w:szCs w:val="20"/>
-                <w:lang w:val="en-ID"/>
-              </w:rPr>
-            </w:pPr>
-            <w:r>
-              <w:rPr>
-                <w:rFonts w:ascii="Times New Roman" w:hAnsi="Times New Roman" w:cs="Times New Roman"/>
-                <w:sz w:val="20"/>
-                <w:szCs w:val="20"/>
-                <w:lang w:val="en-ID"/>
-              </w:rPr>
-              <w:t>Sistem menampilkan informasi sesi PC yang sedang digunakan</w:t>
+            <w:shd w:val="clear" w:color="auto" w:fill="7CEB99"/>
+            <w:hideMark/>
+          </w:tcPr>
+          <w:p>
+            <w:pPr>
+              <w:spacing w:beforeLines="20" w:before="48" w:afterLines="20" w:after="48" w:line="259" w:lineRule="auto"/>
+              <w:rPr>
+                <w:rFonts w:ascii="Times New Roman" w:hAnsi="Times New Roman" w:cs="Times New Roman"/>
+                <w:sz w:val="20"/>
+                <w:szCs w:val="20"/>
+                <w:lang w:val="en-ID"/>
+              </w:rPr>
+            </w:pPr>
+            <w:r>
+              <w:rPr>
+                <w:rFonts w:ascii="Times New Roman" w:hAnsi="Times New Roman" w:cs="Times New Roman"/>
+                <w:sz w:val="20"/>
+                <w:szCs w:val="20"/>
+                <w:lang w:val="en-ID"/>
+              </w:rPr>
+              <w:t>Laporan Transaksi</w:t>
+            </w:r>
+          </w:p>
+        </w:tc>
+        <w:tc>
+          <w:tcPr>
+            <w:tcW w:w="0" w:type="auto"/>
+            <w:hideMark/>
+          </w:tcPr>
+          <w:p>
+            <w:pPr>
+              <w:spacing w:beforeLines="20" w:before="48" w:afterLines="20" w:after="48" w:line="259" w:lineRule="auto"/>
+              <w:rPr>
+                <w:rFonts w:ascii="Times New Roman" w:hAnsi="Times New Roman" w:cs="Times New Roman"/>
+                <w:sz w:val="20"/>
+                <w:szCs w:val="20"/>
+                <w:lang w:val="en-ID"/>
+              </w:rPr>
+            </w:pPr>
+            <w:r>
+              <w:rPr>
+                <w:rFonts w:ascii="Times New Roman" w:hAnsi="Times New Roman" w:cs="Times New Roman"/>
+                <w:sz w:val="20"/>
+                <w:szCs w:val="20"/>
+                <w:lang w:val="en-ID"/>
+              </w:rPr>
+              <w:t>Sistem menampilkan laporan transaksi</w:t>
             </w:r>
           </w:p>
         </w:tc>
@@ -2773,7 +3783,7 @@
                 <w:szCs w:val="20"/>
                 <w:lang w:val="en-ID"/>
               </w:rPr>
-              <w:t>Data sesi PC</w:t>
+              <w:t>Data transaksi</w:t>
             </w:r>
           </w:p>
         </w:tc>
@@ -2811,52 +3821,53 @@
         <w:tc>
           <w:tcPr>
             <w:tcW w:w="0" w:type="auto"/>
-            <w:hideMark/>
-          </w:tcPr>
-          <w:p>
-            <w:pPr>
-              <w:spacing w:beforeLines="20" w:before="48" w:afterLines="20" w:after="48" w:line="259" w:lineRule="auto"/>
-              <w:rPr>
-                <w:rFonts w:ascii="Times New Roman" w:hAnsi="Times New Roman" w:cs="Times New Roman"/>
-                <w:sz w:val="20"/>
-                <w:szCs w:val="20"/>
-                <w:lang w:val="en-ID"/>
-              </w:rPr>
-            </w:pPr>
-            <w:r>
-              <w:rPr>
-                <w:rFonts w:ascii="Times New Roman" w:hAnsi="Times New Roman" w:cs="Times New Roman"/>
-                <w:sz w:val="20"/>
-                <w:szCs w:val="20"/>
-                <w:lang w:val="en-ID"/>
-              </w:rPr>
-              <w:t>Riwayat Transaksi Customer</w:t>
-            </w:r>
-          </w:p>
-        </w:tc>
-        <w:tc>
-          <w:tcPr>
-            <w:tcW w:w="0" w:type="auto"/>
-            <w:hideMark/>
-          </w:tcPr>
-          <w:p>
-            <w:pPr>
-              <w:spacing w:beforeLines="20" w:before="48" w:afterLines="20" w:after="48" w:line="259" w:lineRule="auto"/>
-              <w:rPr>
-                <w:rFonts w:ascii="Times New Roman" w:hAnsi="Times New Roman" w:cs="Times New Roman"/>
-                <w:sz w:val="20"/>
-                <w:szCs w:val="20"/>
-                <w:lang w:val="en-ID"/>
-              </w:rPr>
-            </w:pPr>
-            <w:r>
-              <w:rPr>
-                <w:rFonts w:ascii="Times New Roman" w:hAnsi="Times New Roman" w:cs="Times New Roman"/>
-                <w:sz w:val="20"/>
-                <w:szCs w:val="20"/>
-                <w:lang w:val="en-ID"/>
-              </w:rPr>
-              <w:t>Customer melihat histori transaksi</w:t>
+            <w:shd w:val="clear" w:color="auto" w:fill="7CEB99"/>
+            <w:hideMark/>
+          </w:tcPr>
+          <w:p>
+            <w:pPr>
+              <w:spacing w:beforeLines="20" w:before="48" w:afterLines="20" w:after="48" w:line="259" w:lineRule="auto"/>
+              <w:rPr>
+                <w:rFonts w:ascii="Times New Roman" w:hAnsi="Times New Roman" w:cs="Times New Roman"/>
+                <w:sz w:val="20"/>
+                <w:szCs w:val="20"/>
+                <w:lang w:val="en-ID"/>
+              </w:rPr>
+            </w:pPr>
+            <w:r>
+              <w:rPr>
+                <w:rFonts w:ascii="Times New Roman" w:hAnsi="Times New Roman" w:cs="Times New Roman"/>
+                <w:sz w:val="20"/>
+                <w:szCs w:val="20"/>
+                <w:lang w:val="en-ID"/>
+              </w:rPr>
+              <w:t>Laporan Keuangan</w:t>
+            </w:r>
+          </w:p>
+        </w:tc>
+        <w:tc>
+          <w:tcPr>
+            <w:tcW w:w="0" w:type="auto"/>
+            <w:hideMark/>
+          </w:tcPr>
+          <w:p>
+            <w:pPr>
+              <w:spacing w:beforeLines="20" w:before="48" w:afterLines="20" w:after="48" w:line="259" w:lineRule="auto"/>
+              <w:rPr>
+                <w:rFonts w:ascii="Times New Roman" w:hAnsi="Times New Roman" w:cs="Times New Roman"/>
+                <w:sz w:val="20"/>
+                <w:szCs w:val="20"/>
+                <w:lang w:val="en-ID"/>
+              </w:rPr>
+            </w:pPr>
+            <w:r>
+              <w:rPr>
+                <w:rFonts w:ascii="Times New Roman" w:hAnsi="Times New Roman" w:cs="Times New Roman"/>
+                <w:sz w:val="20"/>
+                <w:szCs w:val="20"/>
+                <w:lang w:val="en-ID"/>
+              </w:rPr>
+              <w:t>Sistem menampilkan total pemasukan dalam koin dan rupiah</w:t>
             </w:r>
           </w:p>
         </w:tc>
@@ -2882,7 +3893,7 @@
                 <w:szCs w:val="20"/>
                 <w:lang w:val="en-ID"/>
               </w:rPr>
-              <w:t>Data transaksi customer</w:t>
+              <w:t>Data transaksi keuangan</w:t>
             </w:r>
           </w:p>
         </w:tc>
@@ -2920,92 +3931,91 @@
         <w:tc>
           <w:tcPr>
             <w:tcW w:w="0" w:type="auto"/>
-            <w:hideMark/>
-          </w:tcPr>
-          <w:p>
-            <w:pPr>
-              <w:spacing w:beforeLines="20" w:before="48" w:afterLines="20" w:after="48" w:line="259" w:lineRule="auto"/>
-              <w:rPr>
-                <w:rFonts w:ascii="Times New Roman" w:hAnsi="Times New Roman" w:cs="Times New Roman"/>
-                <w:sz w:val="20"/>
-                <w:szCs w:val="20"/>
-                <w:lang w:val="en-ID"/>
-              </w:rPr>
-            </w:pPr>
-            <w:r>
-              <w:rPr>
-                <w:rFonts w:ascii="Times New Roman" w:hAnsi="Times New Roman" w:cs="Times New Roman"/>
-                <w:sz w:val="20"/>
-                <w:szCs w:val="20"/>
-                <w:lang w:val="en-ID"/>
-              </w:rPr>
-              <w:t>Riwayat Transaksi Admin</w:t>
-            </w:r>
-          </w:p>
-        </w:tc>
-        <w:tc>
-          <w:tcPr>
-            <w:tcW w:w="0" w:type="auto"/>
-            <w:hideMark/>
-          </w:tcPr>
-          <w:p>
-            <w:pPr>
-              <w:spacing w:beforeLines="20" w:before="48" w:afterLines="20" w:after="48" w:line="259" w:lineRule="auto"/>
-              <w:rPr>
-                <w:rFonts w:ascii="Times New Roman" w:hAnsi="Times New Roman" w:cs="Times New Roman"/>
-                <w:sz w:val="20"/>
-                <w:szCs w:val="20"/>
-                <w:lang w:val="en-ID"/>
-              </w:rPr>
-            </w:pPr>
-            <w:r>
-              <w:rPr>
-                <w:rFonts w:ascii="Times New Roman" w:hAnsi="Times New Roman" w:cs="Times New Roman"/>
-                <w:sz w:val="20"/>
-                <w:szCs w:val="20"/>
-                <w:lang w:val="en-ID"/>
-              </w:rPr>
-              <w:t>Admin melihat seluruh transaksi warnet</w:t>
+            <w:shd w:val="clear" w:color="auto" w:fill="7CEB99"/>
+          </w:tcPr>
+          <w:p>
+            <w:pPr>
+              <w:spacing w:beforeLines="20" w:before="48" w:afterLines="20" w:after="48"/>
+              <w:rPr>
+                <w:rFonts w:ascii="Times New Roman" w:hAnsi="Times New Roman" w:cs="Times New Roman"/>
+                <w:sz w:val="20"/>
+                <w:szCs w:val="20"/>
+                <w:lang w:val="en-ID"/>
+              </w:rPr>
+            </w:pPr>
+            <w:r>
+              <w:rPr>
+                <w:rFonts w:ascii="Times New Roman" w:hAnsi="Times New Roman" w:cs="Times New Roman"/>
+                <w:sz w:val="20"/>
+                <w:szCs w:val="20"/>
+                <w:lang w:val="en-ID"/>
+              </w:rPr>
+              <w:t>Ringkasan Laporan Transaksi</w:t>
+            </w:r>
+          </w:p>
+        </w:tc>
+        <w:tc>
+          <w:tcPr>
+            <w:tcW w:w="0" w:type="auto"/>
+          </w:tcPr>
+          <w:p>
+            <w:pPr>
+              <w:spacing w:beforeLines="20" w:before="48" w:afterLines="20" w:after="48"/>
+              <w:rPr>
+                <w:rFonts w:ascii="Times New Roman" w:hAnsi="Times New Roman" w:cs="Times New Roman"/>
+                <w:sz w:val="20"/>
+                <w:szCs w:val="20"/>
+                <w:lang w:val="en-ID"/>
+              </w:rPr>
+            </w:pPr>
+            <w:r>
+              <w:rPr>
+                <w:rFonts w:ascii="Times New Roman" w:hAnsi="Times New Roman" w:cs="Times New Roman"/>
+                <w:sz w:val="20"/>
+                <w:szCs w:val="20"/>
+                <w:lang w:val="en-ID"/>
+              </w:rPr>
+              <w:t>Sistem menampilkan summary transaksi berdasarkan periode</w:t>
             </w:r>
           </w:p>
         </w:tc>
         <w:tc>
           <w:tcPr>
             <w:tcW w:w="2233" w:type="dxa"/>
-            <w:hideMark/>
-          </w:tcPr>
-          <w:p>
-            <w:pPr>
-              <w:spacing w:beforeLines="20" w:before="48" w:afterLines="20" w:after="48" w:line="259" w:lineRule="auto"/>
-              <w:rPr>
-                <w:rFonts w:ascii="Times New Roman" w:hAnsi="Times New Roman" w:cs="Times New Roman"/>
-                <w:sz w:val="20"/>
-                <w:szCs w:val="20"/>
-                <w:lang w:val="en-ID"/>
-              </w:rPr>
-            </w:pPr>
-            <w:r>
-              <w:rPr>
-                <w:rFonts w:ascii="Times New Roman" w:hAnsi="Times New Roman" w:cs="Times New Roman"/>
-                <w:sz w:val="20"/>
-                <w:szCs w:val="20"/>
-                <w:lang w:val="en-ID"/>
-              </w:rPr>
-              <w:t>Data seluruh transaksi</w:t>
+          </w:tcPr>
+          <w:p>
+            <w:pPr>
+              <w:spacing w:beforeLines="20" w:before="48" w:afterLines="20" w:after="48"/>
+              <w:rPr>
+                <w:rFonts w:ascii="Times New Roman" w:hAnsi="Times New Roman" w:cs="Times New Roman"/>
+                <w:sz w:val="20"/>
+                <w:szCs w:val="20"/>
+                <w:lang w:val="en-ID"/>
+              </w:rPr>
+            </w:pPr>
+            <w:r>
+              <w:rPr>
+                <w:rFonts w:ascii="Times New Roman" w:hAnsi="Times New Roman" w:cs="Times New Roman"/>
+                <w:sz w:val="20"/>
+                <w:szCs w:val="20"/>
+                <w:lang w:val="en-ID"/>
+              </w:rPr>
+              <w:t>Data laporan transaksi</w:t>
             </w:r>
           </w:p>
         </w:tc>
         <w:tc>
           <w:tcPr>
             <w:tcW w:w="1224" w:type="dxa"/>
-            <w:hideMark/>
-          </w:tcPr>
-          <w:p>
-            <w:pPr>
-              <w:spacing w:beforeLines="20" w:before="48" w:afterLines="20" w:after="48" w:line="259" w:lineRule="auto"/>
+          </w:tcPr>
+          <w:p>
+            <w:pPr>
+              <w:spacing w:beforeLines="20" w:before="48" w:afterLines="20" w:after="48"/>
               <w:jc w:val="center"/>
               <w:rPr>
                 <w:rFonts w:ascii="Times New Roman" w:hAnsi="Times New Roman" w:cs="Times New Roman"/>
+                <w:b/>
+                <w:bCs/>
                 <w:sz w:val="20"/>
                 <w:szCs w:val="20"/>
                 <w:lang w:val="en-ID"/>
@@ -3029,52 +4039,53 @@
         <w:tc>
           <w:tcPr>
             <w:tcW w:w="0" w:type="auto"/>
-            <w:hideMark/>
-          </w:tcPr>
-          <w:p>
-            <w:pPr>
-              <w:spacing w:beforeLines="20" w:before="48" w:afterLines="20" w:after="48" w:line="259" w:lineRule="auto"/>
-              <w:rPr>
-                <w:rFonts w:ascii="Times New Roman" w:hAnsi="Times New Roman" w:cs="Times New Roman"/>
-                <w:sz w:val="20"/>
-                <w:szCs w:val="20"/>
-                <w:lang w:val="en-ID"/>
-              </w:rPr>
-            </w:pPr>
-            <w:r>
-              <w:rPr>
-                <w:rFonts w:ascii="Times New Roman" w:hAnsi="Times New Roman" w:cs="Times New Roman"/>
-                <w:sz w:val="20"/>
-                <w:szCs w:val="20"/>
-                <w:lang w:val="en-ID"/>
-              </w:rPr>
-              <w:t>Ringkasan Laporan Transaksi</w:t>
-            </w:r>
-          </w:p>
-        </w:tc>
-        <w:tc>
-          <w:tcPr>
-            <w:tcW w:w="0" w:type="auto"/>
-            <w:hideMark/>
-          </w:tcPr>
-          <w:p>
-            <w:pPr>
-              <w:spacing w:beforeLines="20" w:before="48" w:afterLines="20" w:after="48" w:line="259" w:lineRule="auto"/>
-              <w:rPr>
-                <w:rFonts w:ascii="Times New Roman" w:hAnsi="Times New Roman" w:cs="Times New Roman"/>
-                <w:sz w:val="20"/>
-                <w:szCs w:val="20"/>
-                <w:lang w:val="en-ID"/>
-              </w:rPr>
-            </w:pPr>
-            <w:r>
-              <w:rPr>
-                <w:rFonts w:ascii="Times New Roman" w:hAnsi="Times New Roman" w:cs="Times New Roman"/>
-                <w:sz w:val="20"/>
-                <w:szCs w:val="20"/>
-                <w:lang w:val="en-ID"/>
-              </w:rPr>
-              <w:t>Sistem menampilkan summary transaksi berdasarkan periode</w:t>
+            <w:shd w:val="clear" w:color="auto" w:fill="7CEB99"/>
+            <w:hideMark/>
+          </w:tcPr>
+          <w:p>
+            <w:pPr>
+              <w:spacing w:beforeLines="20" w:before="48" w:afterLines="20" w:after="48" w:line="259" w:lineRule="auto"/>
+              <w:rPr>
+                <w:rFonts w:ascii="Times New Roman" w:hAnsi="Times New Roman" w:cs="Times New Roman"/>
+                <w:sz w:val="20"/>
+                <w:szCs w:val="20"/>
+                <w:lang w:val="en-ID"/>
+              </w:rPr>
+            </w:pPr>
+            <w:r>
+              <w:rPr>
+                <w:rFonts w:ascii="Times New Roman" w:hAnsi="Times New Roman" w:cs="Times New Roman"/>
+                <w:sz w:val="20"/>
+                <w:szCs w:val="20"/>
+                <w:lang w:val="en-ID"/>
+              </w:rPr>
+              <w:t>Download Laporan</w:t>
+            </w:r>
+          </w:p>
+        </w:tc>
+        <w:tc>
+          <w:tcPr>
+            <w:tcW w:w="0" w:type="auto"/>
+            <w:hideMark/>
+          </w:tcPr>
+          <w:p>
+            <w:pPr>
+              <w:spacing w:beforeLines="20" w:before="48" w:afterLines="20" w:after="48" w:line="259" w:lineRule="auto"/>
+              <w:rPr>
+                <w:rFonts w:ascii="Times New Roman" w:hAnsi="Times New Roman" w:cs="Times New Roman"/>
+                <w:sz w:val="20"/>
+                <w:szCs w:val="20"/>
+                <w:lang w:val="en-ID"/>
+              </w:rPr>
+            </w:pPr>
+            <w:r>
+              <w:rPr>
+                <w:rFonts w:ascii="Times New Roman" w:hAnsi="Times New Roman" w:cs="Times New Roman"/>
+                <w:sz w:val="20"/>
+                <w:szCs w:val="20"/>
+                <w:lang w:val="en-ID"/>
+              </w:rPr>
+              <w:t>Admin mengunduh laporan transaksi</w:t>
             </w:r>
           </w:p>
         </w:tc>
@@ -3100,7 +4111,7 @@
                 <w:szCs w:val="20"/>
                 <w:lang w:val="en-ID"/>
               </w:rPr>
-              <w:t>Data laporan transaksi</w:t>
+              <w:t>File laporan</w:t>
             </w:r>
           </w:p>
         </w:tc>
@@ -3138,52 +4149,53 @@
         <w:tc>
           <w:tcPr>
             <w:tcW w:w="0" w:type="auto"/>
-            <w:hideMark/>
-          </w:tcPr>
-          <w:p>
-            <w:pPr>
-              <w:spacing w:beforeLines="20" w:before="48" w:afterLines="20" w:after="48" w:line="259" w:lineRule="auto"/>
-              <w:rPr>
-                <w:rFonts w:ascii="Times New Roman" w:hAnsi="Times New Roman" w:cs="Times New Roman"/>
-                <w:sz w:val="20"/>
-                <w:szCs w:val="20"/>
-                <w:lang w:val="en-ID"/>
-              </w:rPr>
-            </w:pPr>
-            <w:r>
-              <w:rPr>
-                <w:rFonts w:ascii="Times New Roman" w:hAnsi="Times New Roman" w:cs="Times New Roman"/>
-                <w:sz w:val="20"/>
-                <w:szCs w:val="20"/>
-                <w:lang w:val="en-ID"/>
-              </w:rPr>
-              <w:t>Proses Pembayaran</w:t>
-            </w:r>
-          </w:p>
-        </w:tc>
-        <w:tc>
-          <w:tcPr>
-            <w:tcW w:w="0" w:type="auto"/>
-            <w:hideMark/>
-          </w:tcPr>
-          <w:p>
-            <w:pPr>
-              <w:spacing w:beforeLines="20" w:before="48" w:afterLines="20" w:after="48" w:line="259" w:lineRule="auto"/>
-              <w:rPr>
-                <w:rFonts w:ascii="Times New Roman" w:hAnsi="Times New Roman" w:cs="Times New Roman"/>
-                <w:sz w:val="20"/>
-                <w:szCs w:val="20"/>
-                <w:lang w:val="en-ID"/>
-              </w:rPr>
-            </w:pPr>
-            <w:r>
-              <w:rPr>
-                <w:rFonts w:ascii="Times New Roman" w:hAnsi="Times New Roman" w:cs="Times New Roman"/>
-                <w:sz w:val="20"/>
-                <w:szCs w:val="20"/>
-                <w:lang w:val="en-ID"/>
-              </w:rPr>
-              <w:t>Sistem mengirim request pembayaran dan menerima status pembayaran</w:t>
+            <w:shd w:val="clear" w:color="auto" w:fill="F6C3FF"/>
+            <w:hideMark/>
+          </w:tcPr>
+          <w:p>
+            <w:pPr>
+              <w:spacing w:beforeLines="20" w:before="48" w:afterLines="20" w:after="48" w:line="259" w:lineRule="auto"/>
+              <w:rPr>
+                <w:rFonts w:ascii="Times New Roman" w:hAnsi="Times New Roman" w:cs="Times New Roman"/>
+                <w:sz w:val="20"/>
+                <w:szCs w:val="20"/>
+                <w:lang w:val="en-ID"/>
+              </w:rPr>
+            </w:pPr>
+            <w:r>
+              <w:rPr>
+                <w:rFonts w:ascii="Times New Roman" w:hAnsi="Times New Roman" w:cs="Times New Roman"/>
+                <w:sz w:val="20"/>
+                <w:szCs w:val="20"/>
+                <w:lang w:val="en-ID"/>
+              </w:rPr>
+              <w:t>Kelola Akun Customer</w:t>
+            </w:r>
+          </w:p>
+        </w:tc>
+        <w:tc>
+          <w:tcPr>
+            <w:tcW w:w="0" w:type="auto"/>
+            <w:hideMark/>
+          </w:tcPr>
+          <w:p>
+            <w:pPr>
+              <w:spacing w:beforeLines="20" w:before="48" w:afterLines="20" w:after="48" w:line="259" w:lineRule="auto"/>
+              <w:rPr>
+                <w:rFonts w:ascii="Times New Roman" w:hAnsi="Times New Roman" w:cs="Times New Roman"/>
+                <w:sz w:val="20"/>
+                <w:szCs w:val="20"/>
+                <w:lang w:val="en-ID"/>
+              </w:rPr>
+            </w:pPr>
+            <w:r>
+              <w:rPr>
+                <w:rFonts w:ascii="Times New Roman" w:hAnsi="Times New Roman" w:cs="Times New Roman"/>
+                <w:sz w:val="20"/>
+                <w:szCs w:val="20"/>
+                <w:lang w:val="en-ID"/>
+              </w:rPr>
+              <w:t>Customer mengubah username atau password akun</w:t>
             </w:r>
           </w:p>
         </w:tc>
@@ -3209,7 +4221,7 @@
                 <w:szCs w:val="20"/>
                 <w:lang w:val="en-ID"/>
               </w:rPr>
-              <w:t>Data payment gateway</w:t>
+              <w:t>Username baru, Password baru</w:t>
             </w:r>
           </w:p>
         </w:tc>
@@ -3247,52 +4259,53 @@
         <w:tc>
           <w:tcPr>
             <w:tcW w:w="0" w:type="auto"/>
-            <w:hideMark/>
-          </w:tcPr>
-          <w:p>
-            <w:pPr>
-              <w:spacing w:beforeLines="20" w:before="48" w:afterLines="20" w:after="48" w:line="259" w:lineRule="auto"/>
-              <w:rPr>
-                <w:rFonts w:ascii="Times New Roman" w:hAnsi="Times New Roman" w:cs="Times New Roman"/>
-                <w:sz w:val="20"/>
-                <w:szCs w:val="20"/>
-                <w:lang w:val="en-ID"/>
-              </w:rPr>
-            </w:pPr>
-            <w:r>
-              <w:rPr>
-                <w:rFonts w:ascii="Times New Roman" w:hAnsi="Times New Roman" w:cs="Times New Roman"/>
-                <w:sz w:val="20"/>
-                <w:szCs w:val="20"/>
-                <w:lang w:val="en-ID"/>
-              </w:rPr>
-              <w:t>Error Login</w:t>
-            </w:r>
-          </w:p>
-        </w:tc>
-        <w:tc>
-          <w:tcPr>
-            <w:tcW w:w="0" w:type="auto"/>
-            <w:hideMark/>
-          </w:tcPr>
-          <w:p>
-            <w:pPr>
-              <w:spacing w:beforeLines="20" w:before="48" w:afterLines="20" w:after="48" w:line="259" w:lineRule="auto"/>
-              <w:rPr>
-                <w:rFonts w:ascii="Times New Roman" w:hAnsi="Times New Roman" w:cs="Times New Roman"/>
-                <w:sz w:val="20"/>
-                <w:szCs w:val="20"/>
-                <w:lang w:val="en-ID"/>
-              </w:rPr>
-            </w:pPr>
-            <w:r>
-              <w:rPr>
-                <w:rFonts w:ascii="Times New Roman" w:hAnsi="Times New Roman" w:cs="Times New Roman"/>
-                <w:sz w:val="20"/>
-                <w:szCs w:val="20"/>
-                <w:lang w:val="en-ID"/>
-              </w:rPr>
-              <w:t>Sistem menampilkan pesan error jika login gagal</w:t>
+            <w:shd w:val="clear" w:color="auto" w:fill="F6C3FF"/>
+            <w:hideMark/>
+          </w:tcPr>
+          <w:p>
+            <w:pPr>
+              <w:spacing w:beforeLines="20" w:before="48" w:afterLines="20" w:after="48" w:line="259" w:lineRule="auto"/>
+              <w:rPr>
+                <w:rFonts w:ascii="Times New Roman" w:hAnsi="Times New Roman" w:cs="Times New Roman"/>
+                <w:sz w:val="20"/>
+                <w:szCs w:val="20"/>
+                <w:lang w:val="en-ID"/>
+              </w:rPr>
+            </w:pPr>
+            <w:r>
+              <w:rPr>
+                <w:rFonts w:ascii="Times New Roman" w:hAnsi="Times New Roman" w:cs="Times New Roman"/>
+                <w:sz w:val="20"/>
+                <w:szCs w:val="20"/>
+                <w:lang w:val="en-ID"/>
+              </w:rPr>
+              <w:t>Kelola Akun oleh Admin</w:t>
+            </w:r>
+          </w:p>
+        </w:tc>
+        <w:tc>
+          <w:tcPr>
+            <w:tcW w:w="0" w:type="auto"/>
+            <w:hideMark/>
+          </w:tcPr>
+          <w:p>
+            <w:pPr>
+              <w:spacing w:beforeLines="20" w:before="48" w:afterLines="20" w:after="48" w:line="259" w:lineRule="auto"/>
+              <w:rPr>
+                <w:rFonts w:ascii="Times New Roman" w:hAnsi="Times New Roman" w:cs="Times New Roman"/>
+                <w:sz w:val="20"/>
+                <w:szCs w:val="20"/>
+                <w:lang w:val="en-ID"/>
+              </w:rPr>
+            </w:pPr>
+            <w:r>
+              <w:rPr>
+                <w:rFonts w:ascii="Times New Roman" w:hAnsi="Times New Roman" w:cs="Times New Roman"/>
+                <w:sz w:val="20"/>
+                <w:szCs w:val="20"/>
+                <w:lang w:val="en-ID"/>
+              </w:rPr>
+              <w:t>Admin reset password atau menghapus akun customer</w:t>
             </w:r>
           </w:p>
         </w:tc>
@@ -3318,7 +4331,7 @@
                 <w:szCs w:val="20"/>
                 <w:lang w:val="en-ID"/>
               </w:rPr>
-              <w:t>Username/Password salah</w:t>
+              <w:t>Data customer</w:t>
             </w:r>
           </w:p>
         </w:tc>
@@ -3356,52 +4369,53 @@
         <w:tc>
           <w:tcPr>
             <w:tcW w:w="0" w:type="auto"/>
-            <w:hideMark/>
-          </w:tcPr>
-          <w:p>
-            <w:pPr>
-              <w:spacing w:beforeLines="20" w:before="48" w:afterLines="20" w:after="48" w:line="259" w:lineRule="auto"/>
-              <w:rPr>
-                <w:rFonts w:ascii="Times New Roman" w:hAnsi="Times New Roman" w:cs="Times New Roman"/>
-                <w:sz w:val="20"/>
-                <w:szCs w:val="20"/>
-                <w:lang w:val="en-ID"/>
-              </w:rPr>
-            </w:pPr>
-            <w:r>
-              <w:rPr>
-                <w:rFonts w:ascii="Times New Roman" w:hAnsi="Times New Roman" w:cs="Times New Roman"/>
-                <w:sz w:val="20"/>
-                <w:szCs w:val="20"/>
-                <w:lang w:val="en-ID"/>
-              </w:rPr>
-              <w:t>Saldo Tidak Cukup</w:t>
-            </w:r>
-          </w:p>
-        </w:tc>
-        <w:tc>
-          <w:tcPr>
-            <w:tcW w:w="0" w:type="auto"/>
-            <w:hideMark/>
-          </w:tcPr>
-          <w:p>
-            <w:pPr>
-              <w:spacing w:beforeLines="20" w:before="48" w:afterLines="20" w:after="48" w:line="259" w:lineRule="auto"/>
-              <w:rPr>
-                <w:rFonts w:ascii="Times New Roman" w:hAnsi="Times New Roman" w:cs="Times New Roman"/>
-                <w:sz w:val="20"/>
-                <w:szCs w:val="20"/>
-                <w:lang w:val="en-ID"/>
-              </w:rPr>
-            </w:pPr>
-            <w:r>
-              <w:rPr>
-                <w:rFonts w:ascii="Times New Roman" w:hAnsi="Times New Roman" w:cs="Times New Roman"/>
-                <w:sz w:val="20"/>
-                <w:szCs w:val="20"/>
-                <w:lang w:val="en-ID"/>
-              </w:rPr>
-              <w:t>Sistem membatalkan transaksi jika saldo kurang</w:t>
+            <w:shd w:val="clear" w:color="auto" w:fill="FFC6C6"/>
+            <w:hideMark/>
+          </w:tcPr>
+          <w:p>
+            <w:pPr>
+              <w:spacing w:beforeLines="20" w:before="48" w:afterLines="20" w:after="48" w:line="259" w:lineRule="auto"/>
+              <w:rPr>
+                <w:rFonts w:ascii="Times New Roman" w:hAnsi="Times New Roman" w:cs="Times New Roman"/>
+                <w:sz w:val="20"/>
+                <w:szCs w:val="20"/>
+                <w:lang w:val="en-ID"/>
+              </w:rPr>
+            </w:pPr>
+            <w:r>
+              <w:rPr>
+                <w:rFonts w:ascii="Times New Roman" w:hAnsi="Times New Roman" w:cs="Times New Roman"/>
+                <w:sz w:val="20"/>
+                <w:szCs w:val="20"/>
+                <w:lang w:val="en-ID"/>
+              </w:rPr>
+              <w:t>Monitoring Status PC</w:t>
+            </w:r>
+          </w:p>
+        </w:tc>
+        <w:tc>
+          <w:tcPr>
+            <w:tcW w:w="0" w:type="auto"/>
+            <w:hideMark/>
+          </w:tcPr>
+          <w:p>
+            <w:pPr>
+              <w:spacing w:beforeLines="20" w:before="48" w:afterLines="20" w:after="48" w:line="259" w:lineRule="auto"/>
+              <w:rPr>
+                <w:rFonts w:ascii="Times New Roman" w:hAnsi="Times New Roman" w:cs="Times New Roman"/>
+                <w:sz w:val="20"/>
+                <w:szCs w:val="20"/>
+                <w:lang w:val="en-ID"/>
+              </w:rPr>
+            </w:pPr>
+            <w:r>
+              <w:rPr>
+                <w:rFonts w:ascii="Times New Roman" w:hAnsi="Times New Roman" w:cs="Times New Roman"/>
+                <w:sz w:val="20"/>
+                <w:szCs w:val="20"/>
+                <w:lang w:val="en-ID"/>
+              </w:rPr>
+              <w:t>Sistem menampilkan status seluruh PC</w:t>
             </w:r>
           </w:p>
         </w:tc>
@@ -3427,7 +4441,7 @@
                 <w:szCs w:val="20"/>
                 <w:lang w:val="en-ID"/>
               </w:rPr>
-              <w:t>Saldo customer</w:t>
+              <w:t>Data status PC</w:t>
             </w:r>
           </w:p>
         </w:tc>
@@ -3465,52 +4479,53 @@
         <w:tc>
           <w:tcPr>
             <w:tcW w:w="0" w:type="auto"/>
-            <w:hideMark/>
-          </w:tcPr>
-          <w:p>
-            <w:pPr>
-              <w:spacing w:beforeLines="20" w:before="48" w:afterLines="20" w:after="48" w:line="259" w:lineRule="auto"/>
-              <w:rPr>
-                <w:rFonts w:ascii="Times New Roman" w:hAnsi="Times New Roman" w:cs="Times New Roman"/>
-                <w:sz w:val="20"/>
-                <w:szCs w:val="20"/>
-                <w:lang w:val="en-ID"/>
-              </w:rPr>
-            </w:pPr>
-            <w:r>
-              <w:rPr>
-                <w:rFonts w:ascii="Times New Roman" w:hAnsi="Times New Roman" w:cs="Times New Roman"/>
-                <w:sz w:val="20"/>
-                <w:szCs w:val="20"/>
-                <w:lang w:val="en-ID"/>
-              </w:rPr>
-              <w:t>Pembayaran Gagal</w:t>
-            </w:r>
-          </w:p>
-        </w:tc>
-        <w:tc>
-          <w:tcPr>
-            <w:tcW w:w="0" w:type="auto"/>
-            <w:hideMark/>
-          </w:tcPr>
-          <w:p>
-            <w:pPr>
-              <w:spacing w:beforeLines="20" w:before="48" w:afterLines="20" w:after="48" w:line="259" w:lineRule="auto"/>
-              <w:rPr>
-                <w:rFonts w:ascii="Times New Roman" w:hAnsi="Times New Roman" w:cs="Times New Roman"/>
-                <w:sz w:val="20"/>
-                <w:szCs w:val="20"/>
-                <w:lang w:val="en-ID"/>
-              </w:rPr>
-            </w:pPr>
-            <w:r>
-              <w:rPr>
-                <w:rFonts w:ascii="Times New Roman" w:hAnsi="Times New Roman" w:cs="Times New Roman"/>
-                <w:sz w:val="20"/>
-                <w:szCs w:val="20"/>
-                <w:lang w:val="en-ID"/>
-              </w:rPr>
-              <w:t>Sistem tidak menambahkan saldo jika pembayaran gagal</w:t>
+            <w:shd w:val="clear" w:color="auto" w:fill="FFC6C6"/>
+            <w:hideMark/>
+          </w:tcPr>
+          <w:p>
+            <w:pPr>
+              <w:spacing w:beforeLines="20" w:before="48" w:afterLines="20" w:after="48" w:line="259" w:lineRule="auto"/>
+              <w:rPr>
+                <w:rFonts w:ascii="Times New Roman" w:hAnsi="Times New Roman" w:cs="Times New Roman"/>
+                <w:sz w:val="20"/>
+                <w:szCs w:val="20"/>
+                <w:lang w:val="en-ID"/>
+              </w:rPr>
+            </w:pPr>
+            <w:r>
+              <w:rPr>
+                <w:rFonts w:ascii="Times New Roman" w:hAnsi="Times New Roman" w:cs="Times New Roman"/>
+                <w:sz w:val="20"/>
+                <w:szCs w:val="20"/>
+                <w:lang w:val="en-ID"/>
+              </w:rPr>
+              <w:t>Informasi Sesi PC</w:t>
+            </w:r>
+          </w:p>
+        </w:tc>
+        <w:tc>
+          <w:tcPr>
+            <w:tcW w:w="0" w:type="auto"/>
+            <w:hideMark/>
+          </w:tcPr>
+          <w:p>
+            <w:pPr>
+              <w:spacing w:beforeLines="20" w:before="48" w:afterLines="20" w:after="48" w:line="259" w:lineRule="auto"/>
+              <w:rPr>
+                <w:rFonts w:ascii="Times New Roman" w:hAnsi="Times New Roman" w:cs="Times New Roman"/>
+                <w:sz w:val="20"/>
+                <w:szCs w:val="20"/>
+                <w:lang w:val="en-ID"/>
+              </w:rPr>
+            </w:pPr>
+            <w:r>
+              <w:rPr>
+                <w:rFonts w:ascii="Times New Roman" w:hAnsi="Times New Roman" w:cs="Times New Roman"/>
+                <w:sz w:val="20"/>
+                <w:szCs w:val="20"/>
+                <w:lang w:val="en-ID"/>
+              </w:rPr>
+              <w:t>Sistem menampilkan informasi sesi PC yang sedang digunakan</w:t>
             </w:r>
           </w:p>
         </w:tc>
@@ -3536,7 +4551,7 @@
                 <w:szCs w:val="20"/>
                 <w:lang w:val="en-ID"/>
               </w:rPr>
-              <w:t>Status pembayaran gagal</w:t>
+              <w:t>Data sesi PC</w:t>
             </w:r>
           </w:p>
         </w:tc>
@@ -3574,52 +4589,53 @@
         <w:tc>
           <w:tcPr>
             <w:tcW w:w="0" w:type="auto"/>
-            <w:hideMark/>
-          </w:tcPr>
-          <w:p>
-            <w:pPr>
-              <w:spacing w:beforeLines="20" w:before="48" w:afterLines="20" w:after="48" w:line="259" w:lineRule="auto"/>
-              <w:rPr>
-                <w:rFonts w:ascii="Times New Roman" w:hAnsi="Times New Roman" w:cs="Times New Roman"/>
-                <w:sz w:val="20"/>
-                <w:szCs w:val="20"/>
-                <w:lang w:val="en-ID"/>
-              </w:rPr>
-            </w:pPr>
-            <w:r>
-              <w:rPr>
-                <w:rFonts w:ascii="Times New Roman" w:hAnsi="Times New Roman" w:cs="Times New Roman"/>
-                <w:sz w:val="20"/>
-                <w:szCs w:val="20"/>
-                <w:lang w:val="en-ID"/>
-              </w:rPr>
-              <w:t>Countdown Berakhir</w:t>
-            </w:r>
-          </w:p>
-        </w:tc>
-        <w:tc>
-          <w:tcPr>
-            <w:tcW w:w="0" w:type="auto"/>
-            <w:hideMark/>
-          </w:tcPr>
-          <w:p>
-            <w:pPr>
-              <w:spacing w:beforeLines="20" w:before="48" w:afterLines="20" w:after="48" w:line="259" w:lineRule="auto"/>
-              <w:rPr>
-                <w:rFonts w:ascii="Times New Roman" w:hAnsi="Times New Roman" w:cs="Times New Roman"/>
-                <w:sz w:val="20"/>
-                <w:szCs w:val="20"/>
-                <w:lang w:val="en-ID"/>
-              </w:rPr>
-            </w:pPr>
-            <w:r>
-              <w:rPr>
-                <w:rFonts w:ascii="Times New Roman" w:hAnsi="Times New Roman" w:cs="Times New Roman"/>
-                <w:sz w:val="20"/>
-                <w:szCs w:val="20"/>
-                <w:lang w:val="en-ID"/>
-              </w:rPr>
-              <w:t>Sistem otomatis mengakhiri sesi saat waktu habis</w:t>
+            <w:shd w:val="clear" w:color="auto" w:fill="76E3FF"/>
+            <w:hideMark/>
+          </w:tcPr>
+          <w:p>
+            <w:pPr>
+              <w:spacing w:beforeLines="20" w:before="48" w:afterLines="20" w:after="48" w:line="259" w:lineRule="auto"/>
+              <w:rPr>
+                <w:rFonts w:ascii="Times New Roman" w:hAnsi="Times New Roman" w:cs="Times New Roman"/>
+                <w:sz w:val="20"/>
+                <w:szCs w:val="20"/>
+                <w:lang w:val="en-ID"/>
+              </w:rPr>
+            </w:pPr>
+            <w:r>
+              <w:rPr>
+                <w:rFonts w:ascii="Times New Roman" w:hAnsi="Times New Roman" w:cs="Times New Roman"/>
+                <w:sz w:val="20"/>
+                <w:szCs w:val="20"/>
+                <w:lang w:val="en-ID"/>
+              </w:rPr>
+              <w:t>Saldo Tidak Cukup</w:t>
+            </w:r>
+          </w:p>
+        </w:tc>
+        <w:tc>
+          <w:tcPr>
+            <w:tcW w:w="0" w:type="auto"/>
+            <w:hideMark/>
+          </w:tcPr>
+          <w:p>
+            <w:pPr>
+              <w:spacing w:beforeLines="20" w:before="48" w:afterLines="20" w:after="48" w:line="259" w:lineRule="auto"/>
+              <w:rPr>
+                <w:rFonts w:ascii="Times New Roman" w:hAnsi="Times New Roman" w:cs="Times New Roman"/>
+                <w:sz w:val="20"/>
+                <w:szCs w:val="20"/>
+                <w:lang w:val="en-ID"/>
+              </w:rPr>
+            </w:pPr>
+            <w:r>
+              <w:rPr>
+                <w:rFonts w:ascii="Times New Roman" w:hAnsi="Times New Roman" w:cs="Times New Roman"/>
+                <w:sz w:val="20"/>
+                <w:szCs w:val="20"/>
+                <w:lang w:val="en-ID"/>
+              </w:rPr>
+              <w:t>Sistem membatalkan transaksi jika saldo kurang</w:t>
             </w:r>
           </w:p>
         </w:tc>
@@ -3645,7 +4661,7 @@
                 <w:szCs w:val="20"/>
                 <w:lang w:val="en-ID"/>
               </w:rPr>
-              <w:t>Waktu sesi habis</w:t>
+              <w:t>Saldo customer</w:t>
             </w:r>
           </w:p>
         </w:tc>

</xml_diff>